<commit_message>
docs(module-4.6): update report and walkthrough with confirmed 4.6.3-4.6.6 results
- RASP Report: replace 'Pending' section 5 with confirmed results for all 6 exercises
  - 4.6.3: Contrast incompatible — 3-failure root cause table (ESM/familySync/fireball)
  - 4.6.4: AppSensor LOG→429→403 confirmed output documented
  - 4.6.5: Datadog ASM 403 confirmed — detect-libc fix + dd-blocking-rules.json fix documented
  - 4.6.6: Signal Sciences sidecar architecture documented
  - Roadblocks table: 7 new rows covering Contrast + Datadog debugging chain
- Walkthrough: add 4.6.3-4.6.6 exercise sections with commands and confirmed output
  - Quick Reference, Roadblocks, and Scripts Reference tables updated with M4.6 entries
</commit_message>
<xml_diff>
--- a/devsecops-lab/docs/Lab-Walkthrough-Modules-1-to-4.6.docx
+++ b/devsecops-lab/docs/Lab-Walkthrough-Modules-1-to-4.6.docx
@@ -5547,6 +5547,421 @@
           </w:p>
         </w:tc>
       </w:tr>
+      <w:tr>
+        <w:tc>
+          <w:tcPr>
+            <w:tcW w:type="dxa" w:w="700"/>
+            <w:tcBorders>
+              <w:top w:val="single" w:sz="4" w:color="DDDDDD"/>
+              <w:left w:val="single" w:sz="4" w:color="DDDDDD"/>
+              <w:bottom w:val="single" w:sz="4" w:color="DDDDDD"/>
+              <w:right w:val="single" w:sz="4" w:color="DDDDDD"/>
+            </w:tcBorders>
+            <w:shd w:val="clear" w:color="auto" w:fill="F0F4F8"/>
+            <w:tcMar>
+              <w:top w:w="80" w:type="dxa"/>
+              <w:bottom w:w="80" w:type="dxa"/>
+              <w:left w:w="120" w:type="dxa"/>
+              <w:right w:w="120" w:type="dxa"/>
+            </w:tcMar>
+          </w:tcPr>
+          <w:p>
+            <w:r>
+              <w:rPr>
+                <w:rFonts w:ascii="Arial" w:hAnsi="Arial"/>
+                <w:sz w:val="20"/>
+              </w:rPr>
+              <w:t xml:space="preserve">M4.6</w:t>
+            </w:r>
+          </w:p>
+        </w:tc>
+        <w:tc>
+          <w:tcPr>
+            <w:tcW w:type="dxa" w:w="4000"/>
+            <w:tcBorders>
+              <w:top w:val="single" w:sz="4" w:color="DDDDDD"/>
+              <w:left w:val="single" w:sz="4" w:color="DDDDDD"/>
+              <w:bottom w:val="single" w:sz="4" w:color="DDDDDD"/>
+              <w:right w:val="single" w:sz="4" w:color="DDDDDD"/>
+            </w:tcBorders>
+            <w:shd w:val="clear" w:color="auto" w:fill="F0F4F8"/>
+            <w:tcMar>
+              <w:top w:w="80" w:type="dxa"/>
+              <w:bottom w:w="80" w:type="dxa"/>
+              <w:left w:w="120" w:type="dxa"/>
+              <w:right w:w="120" w:type="dxa"/>
+            </w:tcMar>
+          </w:tcPr>
+          <w:p>
+            <w:r>
+              <w:rPr>
+                <w:rFonts w:ascii="Arial" w:hAnsi="Arial"/>
+                <w:sz w:val="20"/>
+              </w:rPr>
+              <w:t xml:space="preserve">docker compose --profile appsensor build &amp;&amp; up -d</w:t>
+            </w:r>
+          </w:p>
+        </w:tc>
+        <w:tc>
+          <w:tcPr>
+            <w:tcW w:type="dxa" w:w="4660"/>
+            <w:tcBorders>
+              <w:top w:val="single" w:sz="4" w:color="DDDDDD"/>
+              <w:left w:val="single" w:sz="4" w:color="DDDDDD"/>
+              <w:bottom w:val="single" w:sz="4" w:color="DDDDDD"/>
+              <w:right w:val="single" w:sz="4" w:color="DDDDDD"/>
+            </w:tcBorders>
+            <w:shd w:val="clear" w:color="auto" w:fill="F0F4F8"/>
+            <w:tcMar>
+              <w:top w:w="80" w:type="dxa"/>
+              <w:bottom w:w="80" w:type="dxa"/>
+              <w:left w:w="120" w:type="dxa"/>
+              <w:right w:w="120" w:type="dxa"/>
+            </w:tcMar>
+          </w:tcPr>
+          <w:p>
+            <w:r>
+              <w:rPr>
+                <w:rFonts w:ascii="Arial" w:hAnsi="Arial"/>
+                <w:sz w:val="20"/>
+              </w:rPr>
+              <w:t xml:space="preserve">Start AppSensor-instrumented Juice Shop on port 3004</w:t>
+            </w:r>
+          </w:p>
+        </w:tc>
+      </w:tr>
+      <w:tr>
+        <w:tc>
+          <w:tcPr>
+            <w:tcW w:type="dxa" w:w="700"/>
+            <w:tcBorders>
+              <w:top w:val="single" w:sz="4" w:color="DDDDDD"/>
+              <w:left w:val="single" w:sz="4" w:color="DDDDDD"/>
+              <w:bottom w:val="single" w:sz="4" w:color="DDDDDD"/>
+              <w:right w:val="single" w:sz="4" w:color="DDDDDD"/>
+            </w:tcBorders>
+            <w:shd w:val="clear" w:color="auto" w:fill="FFFFFF"/>
+            <w:tcMar>
+              <w:top w:w="80" w:type="dxa"/>
+              <w:bottom w:w="80" w:type="dxa"/>
+              <w:left w:w="120" w:type="dxa"/>
+              <w:right w:w="120" w:type="dxa"/>
+            </w:tcMar>
+          </w:tcPr>
+          <w:p>
+            <w:r>
+              <w:rPr>
+                <w:rFonts w:ascii="Arial" w:hAnsi="Arial"/>
+                <w:sz w:val="20"/>
+              </w:rPr>
+              <w:t xml:space="preserve">M4.6</w:t>
+            </w:r>
+          </w:p>
+        </w:tc>
+        <w:tc>
+          <w:tcPr>
+            <w:tcW w:type="dxa" w:w="4000"/>
+            <w:tcBorders>
+              <w:top w:val="single" w:sz="4" w:color="DDDDDD"/>
+              <w:left w:val="single" w:sz="4" w:color="DDDDDD"/>
+              <w:bottom w:val="single" w:sz="4" w:color="DDDDDD"/>
+              <w:right w:val="single" w:sz="4" w:color="DDDDDD"/>
+            </w:tcBorders>
+            <w:shd w:val="clear" w:color="auto" w:fill="FFFFFF"/>
+            <w:tcMar>
+              <w:top w:w="80" w:type="dxa"/>
+              <w:bottom w:w="80" w:type="dxa"/>
+              <w:left w:w="120" w:type="dxa"/>
+              <w:right w:w="120" w:type="dxa"/>
+            </w:tcMar>
+          </w:tcPr>
+          <w:p>
+            <w:r>
+              <w:rPr>
+                <w:rFonts w:ascii="Arial" w:hAnsi="Arial"/>
+                <w:sz w:val="20"/>
+              </w:rPr>
+              <w:t xml:space="preserve">for i in {1..6}; do curl ... http://localhost:3004/...?q=SQLi; done</w:t>
+            </w:r>
+          </w:p>
+        </w:tc>
+        <w:tc>
+          <w:tcPr>
+            <w:tcW w:type="dxa" w:w="4660"/>
+            <w:tcBorders>
+              <w:top w:val="single" w:sz="4" w:color="DDDDDD"/>
+              <w:left w:val="single" w:sz="4" w:color="DDDDDD"/>
+              <w:bottom w:val="single" w:sz="4" w:color="DDDDDD"/>
+              <w:right w:val="single" w:sz="4" w:color="DDDDDD"/>
+            </w:tcBorders>
+            <w:shd w:val="clear" w:color="auto" w:fill="FFFFFF"/>
+            <w:tcMar>
+              <w:top w:w="80" w:type="dxa"/>
+              <w:bottom w:w="80" w:type="dxa"/>
+              <w:left w:w="120" w:type="dxa"/>
+              <w:right w:w="120" w:type="dxa"/>
+            </w:tcMar>
+          </w:tcPr>
+          <w:p>
+            <w:r>
+              <w:rPr>
+                <w:rFonts w:ascii="Arial" w:hAnsi="Arial"/>
+                <w:sz w:val="20"/>
+              </w:rPr>
+              <w:t xml:space="preserve">Trigger LOG→WARN→BLOCK escalation sequence</w:t>
+            </w:r>
+          </w:p>
+        </w:tc>
+      </w:tr>
+      <w:tr>
+        <w:tc>
+          <w:tcPr>
+            <w:tcW w:type="dxa" w:w="700"/>
+            <w:tcBorders>
+              <w:top w:val="single" w:sz="4" w:color="DDDDDD"/>
+              <w:left w:val="single" w:sz="4" w:color="DDDDDD"/>
+              <w:bottom w:val="single" w:sz="4" w:color="DDDDDD"/>
+              <w:right w:val="single" w:sz="4" w:color="DDDDDD"/>
+            </w:tcBorders>
+            <w:shd w:val="clear" w:color="auto" w:fill="F0F4F8"/>
+            <w:tcMar>
+              <w:top w:w="80" w:type="dxa"/>
+              <w:bottom w:w="80" w:type="dxa"/>
+              <w:left w:w="120" w:type="dxa"/>
+              <w:right w:w="120" w:type="dxa"/>
+            </w:tcMar>
+          </w:tcPr>
+          <w:p>
+            <w:r>
+              <w:rPr>
+                <w:rFonts w:ascii="Arial" w:hAnsi="Arial"/>
+                <w:sz w:val="20"/>
+              </w:rPr>
+              <w:t xml:space="preserve">M4.6</w:t>
+            </w:r>
+          </w:p>
+        </w:tc>
+        <w:tc>
+          <w:tcPr>
+            <w:tcW w:type="dxa" w:w="4000"/>
+            <w:tcBorders>
+              <w:top w:val="single" w:sz="4" w:color="DDDDDD"/>
+              <w:left w:val="single" w:sz="4" w:color="DDDDDD"/>
+              <w:bottom w:val="single" w:sz="4" w:color="DDDDDD"/>
+              <w:right w:val="single" w:sz="4" w:color="DDDDDD"/>
+            </w:tcBorders>
+            <w:shd w:val="clear" w:color="auto" w:fill="F0F4F8"/>
+            <w:tcMar>
+              <w:top w:w="80" w:type="dxa"/>
+              <w:bottom w:w="80" w:type="dxa"/>
+              <w:left w:w="120" w:type="dxa"/>
+              <w:right w:w="120" w:type="dxa"/>
+            </w:tcMar>
+          </w:tcPr>
+          <w:p>
+            <w:r>
+              <w:rPr>
+                <w:rFonts w:ascii="Arial" w:hAnsi="Arial"/>
+                <w:sz w:val="20"/>
+              </w:rPr>
+              <w:t xml:space="preserve">docker compose --profile datadog-asm build &amp;&amp; up -d</w:t>
+            </w:r>
+          </w:p>
+        </w:tc>
+        <w:tc>
+          <w:tcPr>
+            <w:tcW w:type="dxa" w:w="4660"/>
+            <w:tcBorders>
+              <w:top w:val="single" w:sz="4" w:color="DDDDDD"/>
+              <w:left w:val="single" w:sz="4" w:color="DDDDDD"/>
+              <w:bottom w:val="single" w:sz="4" w:color="DDDDDD"/>
+              <w:right w:val="single" w:sz="4" w:color="DDDDDD"/>
+            </w:tcBorders>
+            <w:shd w:val="clear" w:color="auto" w:fill="F0F4F8"/>
+            <w:tcMar>
+              <w:top w:w="80" w:type="dxa"/>
+              <w:bottom w:w="80" w:type="dxa"/>
+              <w:left w:w="120" w:type="dxa"/>
+              <w:right w:w="120" w:type="dxa"/>
+            </w:tcMar>
+          </w:tcPr>
+          <w:p>
+            <w:r>
+              <w:rPr>
+                <w:rFonts w:ascii="Arial" w:hAnsi="Arial"/>
+                <w:sz w:val="20"/>
+              </w:rPr>
+              <w:t xml:space="preserve">Start Datadog ASM-instrumented Juice Shop on port 3005</w:t>
+            </w:r>
+          </w:p>
+        </w:tc>
+      </w:tr>
+      <w:tr>
+        <w:tc>
+          <w:tcPr>
+            <w:tcW w:type="dxa" w:w="700"/>
+            <w:tcBorders>
+              <w:top w:val="single" w:sz="4" w:color="DDDDDD"/>
+              <w:left w:val="single" w:sz="4" w:color="DDDDDD"/>
+              <w:bottom w:val="single" w:sz="4" w:color="DDDDDD"/>
+              <w:right w:val="single" w:sz="4" w:color="DDDDDD"/>
+            </w:tcBorders>
+            <w:shd w:val="clear" w:color="auto" w:fill="FFFFFF"/>
+            <w:tcMar>
+              <w:top w:w="80" w:type="dxa"/>
+              <w:bottom w:w="80" w:type="dxa"/>
+              <w:left w:w="120" w:type="dxa"/>
+              <w:right w:w="120" w:type="dxa"/>
+            </w:tcMar>
+          </w:tcPr>
+          <w:p>
+            <w:r>
+              <w:rPr>
+                <w:rFonts w:ascii="Arial" w:hAnsi="Arial"/>
+                <w:sz w:val="20"/>
+              </w:rPr>
+              <w:t xml:space="preserve">M4.6</w:t>
+            </w:r>
+          </w:p>
+        </w:tc>
+        <w:tc>
+          <w:tcPr>
+            <w:tcW w:type="dxa" w:w="4000"/>
+            <w:tcBorders>
+              <w:top w:val="single" w:sz="4" w:color="DDDDDD"/>
+              <w:left w:val="single" w:sz="4" w:color="DDDDDD"/>
+              <w:bottom w:val="single" w:sz="4" w:color="DDDDDD"/>
+              <w:right w:val="single" w:sz="4" w:color="DDDDDD"/>
+            </w:tcBorders>
+            <w:shd w:val="clear" w:color="auto" w:fill="FFFFFF"/>
+            <w:tcMar>
+              <w:top w:w="80" w:type="dxa"/>
+              <w:bottom w:w="80" w:type="dxa"/>
+              <w:left w:w="120" w:type="dxa"/>
+              <w:right w:w="120" w:type="dxa"/>
+            </w:tcMar>
+          </w:tcPr>
+          <w:p>
+            <w:r>
+              <w:rPr>
+                <w:rFonts w:ascii="Arial" w:hAnsi="Arial"/>
+                <w:sz w:val="20"/>
+              </w:rPr>
+              <w:t xml:space="preserve">curl -w "%{http_code}" http://localhost:3005/...?q=%27+OR+1%3D1--</w:t>
+            </w:r>
+          </w:p>
+        </w:tc>
+        <w:tc>
+          <w:tcPr>
+            <w:tcW w:type="dxa" w:w="4660"/>
+            <w:tcBorders>
+              <w:top w:val="single" w:sz="4" w:color="DDDDDD"/>
+              <w:left w:val="single" w:sz="4" w:color="DDDDDD"/>
+              <w:bottom w:val="single" w:sz="4" w:color="DDDDDD"/>
+              <w:right w:val="single" w:sz="4" w:color="DDDDDD"/>
+            </w:tcBorders>
+            <w:shd w:val="clear" w:color="auto" w:fill="FFFFFF"/>
+            <w:tcMar>
+              <w:top w:w="80" w:type="dxa"/>
+              <w:bottom w:w="80" w:type="dxa"/>
+              <w:left w:w="120" w:type="dxa"/>
+              <w:right w:w="120" w:type="dxa"/>
+            </w:tcMar>
+          </w:tcPr>
+          <w:p>
+            <w:r>
+              <w:rPr>
+                <w:rFonts w:ascii="Arial" w:hAnsi="Arial"/>
+                <w:sz w:val="20"/>
+              </w:rPr>
+              <w:t xml:space="preserve">Test Datadog ASM SQLi blocking (expect 403)</w:t>
+            </w:r>
+          </w:p>
+        </w:tc>
+      </w:tr>
+      <w:tr>
+        <w:tc>
+          <w:tcPr>
+            <w:tcW w:type="dxa" w:w="700"/>
+            <w:tcBorders>
+              <w:top w:val="single" w:sz="4" w:color="DDDDDD"/>
+              <w:left w:val="single" w:sz="4" w:color="DDDDDD"/>
+              <w:bottom w:val="single" w:sz="4" w:color="DDDDDD"/>
+              <w:right w:val="single" w:sz="4" w:color="DDDDDD"/>
+            </w:tcBorders>
+            <w:shd w:val="clear" w:color="auto" w:fill="F0F4F8"/>
+            <w:tcMar>
+              <w:top w:w="80" w:type="dxa"/>
+              <w:bottom w:w="80" w:type="dxa"/>
+              <w:left w:w="120" w:type="dxa"/>
+              <w:right w:w="120" w:type="dxa"/>
+            </w:tcMar>
+          </w:tcPr>
+          <w:p>
+            <w:r>
+              <w:rPr>
+                <w:rFonts w:ascii="Arial" w:hAnsi="Arial"/>
+                <w:sz w:val="20"/>
+              </w:rPr>
+              <w:t xml:space="preserve">M4.6</w:t>
+            </w:r>
+          </w:p>
+        </w:tc>
+        <w:tc>
+          <w:tcPr>
+            <w:tcW w:type="dxa" w:w="4000"/>
+            <w:tcBorders>
+              <w:top w:val="single" w:sz="4" w:color="DDDDDD"/>
+              <w:left w:val="single" w:sz="4" w:color="DDDDDD"/>
+              <w:bottom w:val="single" w:sz="4" w:color="DDDDDD"/>
+              <w:right w:val="single" w:sz="4" w:color="DDDDDD"/>
+            </w:tcBorders>
+            <w:shd w:val="clear" w:color="auto" w:fill="F0F4F8"/>
+            <w:tcMar>
+              <w:top w:w="80" w:type="dxa"/>
+              <w:bottom w:w="80" w:type="dxa"/>
+              <w:left w:w="120" w:type="dxa"/>
+              <w:right w:w="120" w:type="dxa"/>
+            </w:tcMar>
+          </w:tcPr>
+          <w:p>
+            <w:r>
+              <w:rPr>
+                <w:rFonts w:ascii="Arial" w:hAnsi="Arial"/>
+                <w:sz w:val="20"/>
+              </w:rPr>
+              <w:t xml:space="preserve">docker compose logs -f juice-shop-appsensor | grep AppSensor</w:t>
+            </w:r>
+          </w:p>
+        </w:tc>
+        <w:tc>
+          <w:tcPr>
+            <w:tcW w:type="dxa" w:w="4660"/>
+            <w:tcBorders>
+              <w:top w:val="single" w:sz="4" w:color="DDDDDD"/>
+              <w:left w:val="single" w:sz="4" w:color="DDDDDD"/>
+              <w:bottom w:val="single" w:sz="4" w:color="DDDDDD"/>
+              <w:right w:val="single" w:sz="4" w:color="DDDDDD"/>
+            </w:tcBorders>
+            <w:shd w:val="clear" w:color="auto" w:fill="F0F4F8"/>
+            <w:tcMar>
+              <w:top w:w="80" w:type="dxa"/>
+              <w:bottom w:w="80" w:type="dxa"/>
+              <w:left w:w="120" w:type="dxa"/>
+              <w:right w:w="120" w:type="dxa"/>
+            </w:tcMar>
+          </w:tcPr>
+          <w:p>
+            <w:r>
+              <w:rPr>
+                <w:rFonts w:ascii="Arial" w:hAnsi="Arial"/>
+                <w:sz w:val="20"/>
+              </w:rPr>
+              <w:t xml:space="preserve">Stream AppSensor detection + response events</w:t>
+            </w:r>
+          </w:p>
+        </w:tc>
+      </w:tr>
     </w:tbl>
     <w:p>
       <w:pPr>
@@ -6742,6 +7157,587 @@
                 <w:sz w:val="20"/>
               </w:rPr>
               <w:t>Remove juice-shop from compose. Point BACKEND to host.docker.internal:3000.</w:t>
+            </w:r>
+          </w:p>
+        </w:tc>
+      </w:tr>
+      <w:tr>
+        <w:tc>
+          <w:tcPr>
+            <w:tcW w:type="dxa" w:w="900"/>
+            <w:tcBorders>
+              <w:top w:val="single" w:sz="4" w:color="DDDDDD"/>
+              <w:left w:val="single" w:sz="4" w:color="DDDDDD"/>
+              <w:bottom w:val="single" w:sz="4" w:color="DDDDDD"/>
+              <w:right w:val="single" w:sz="4" w:color="DDDDDD"/>
+            </w:tcBorders>
+            <w:shd w:val="clear" w:color="auto" w:fill="F0F4F8"/>
+            <w:tcMar>
+              <w:top w:w="80" w:type="dxa"/>
+              <w:bottom w:w="80" w:type="dxa"/>
+              <w:left w:w="120" w:type="dxa"/>
+              <w:right w:w="120" w:type="dxa"/>
+            </w:tcMar>
+          </w:tcPr>
+          <w:p>
+            <w:r>
+              <w:rPr>
+                <w:rFonts w:ascii="Arial" w:hAnsi="Arial"/>
+                <w:sz w:val="20"/>
+              </w:rPr>
+              <w:t xml:space="preserve">M4.6</w:t>
+            </w:r>
+          </w:p>
+        </w:tc>
+        <w:tc>
+          <w:tcPr>
+            <w:tcW w:type="dxa" w:w="3700"/>
+            <w:tcBorders>
+              <w:top w:val="single" w:sz="4" w:color="DDDDDD"/>
+              <w:left w:val="single" w:sz="4" w:color="DDDDDD"/>
+              <w:bottom w:val="single" w:sz="4" w:color="DDDDDD"/>
+              <w:right w:val="single" w:sz="4" w:color="DDDDDD"/>
+            </w:tcBorders>
+            <w:shd w:val="clear" w:color="auto" w:fill="F0F4F8"/>
+            <w:tcMar>
+              <w:top w:w="80" w:type="dxa"/>
+              <w:bottom w:w="80" w:type="dxa"/>
+              <w:left w:w="120" w:type="dxa"/>
+              <w:right w:w="120" w:type="dxa"/>
+            </w:tcMar>
+          </w:tcPr>
+          <w:p>
+            <w:r>
+              <w:rPr>
+                <w:rFonts w:ascii="Arial" w:hAnsi="Arial"/>
+                <w:sz w:val="20"/>
+              </w:rPr>
+              <w:t xml:space="preserve">Contrast: require() on ESM graph with top-level await</w:t>
+            </w:r>
+          </w:p>
+        </w:tc>
+        <w:tc>
+          <w:tcPr>
+            <w:tcW w:type="dxa" w:w="4760"/>
+            <w:tcBorders>
+              <w:top w:val="single" w:sz="4" w:color="DDDDDD"/>
+              <w:left w:val="single" w:sz="4" w:color="DDDDDD"/>
+              <w:bottom w:val="single" w:sz="4" w:color="DDDDDD"/>
+              <w:right w:val="single" w:sz="4" w:color="DDDDDD"/>
+            </w:tcBorders>
+            <w:shd w:val="clear" w:color="auto" w:fill="F0F4F8"/>
+            <w:tcMar>
+              <w:top w:w="80" w:type="dxa"/>
+              <w:bottom w:w="80" w:type="dxa"/>
+              <w:left w:w="120" w:type="dxa"/>
+              <w:right w:w="120" w:type="dxa"/>
+            </w:tcMar>
+          </w:tcPr>
+          <w:p>
+            <w:r>
+              <w:rPr>
+                <w:rFonts w:ascii="Arial" w:hAnsi="Arial"/>
+                <w:sz w:val="20"/>
+              </w:rPr>
+              <w:t xml:space="preserve">--import file:///contrast-rasp-loader.mjs instead of --require</w:t>
+            </w:r>
+          </w:p>
+        </w:tc>
+      </w:tr>
+      <w:tr>
+        <w:tc>
+          <w:tcPr>
+            <w:tcW w:type="dxa" w:w="900"/>
+            <w:tcBorders>
+              <w:top w:val="single" w:sz="4" w:color="DDDDDD"/>
+              <w:left w:val="single" w:sz="4" w:color="DDDDDD"/>
+              <w:bottom w:val="single" w:sz="4" w:color="DDDDDD"/>
+              <w:right w:val="single" w:sz="4" w:color="DDDDDD"/>
+            </w:tcBorders>
+            <w:shd w:val="clear" w:color="auto" w:fill="FFFFFF"/>
+            <w:tcMar>
+              <w:top w:w="80" w:type="dxa"/>
+              <w:bottom w:w="80" w:type="dxa"/>
+              <w:left w:w="120" w:type="dxa"/>
+              <w:right w:w="120" w:type="dxa"/>
+            </w:tcMar>
+          </w:tcPr>
+          <w:p>
+            <w:r>
+              <w:rPr>
+                <w:rFonts w:ascii="Arial" w:hAnsi="Arial"/>
+                <w:sz w:val="20"/>
+              </w:rPr>
+              <w:t xml:space="preserve">M4.6</w:t>
+            </w:r>
+          </w:p>
+        </w:tc>
+        <w:tc>
+          <w:tcPr>
+            <w:tcW w:type="dxa" w:w="3700"/>
+            <w:tcBorders>
+              <w:top w:val="single" w:sz="4" w:color="DDDDDD"/>
+              <w:left w:val="single" w:sz="4" w:color="DDDDDD"/>
+              <w:bottom w:val="single" w:sz="4" w:color="DDDDDD"/>
+              <w:right w:val="single" w:sz="4" w:color="DDDDDD"/>
+            </w:tcBorders>
+            <w:shd w:val="clear" w:color="auto" w:fill="FFFFFF"/>
+            <w:tcMar>
+              <w:top w:w="80" w:type="dxa"/>
+              <w:bottom w:w="80" w:type="dxa"/>
+              <w:left w:w="120" w:type="dxa"/>
+              <w:right w:w="120" w:type="dxa"/>
+            </w:tcMar>
+          </w:tcPr>
+          <w:p>
+            <w:r>
+              <w:rPr>
+                <w:rFonts w:ascii="Arial" w:hAnsi="Arial"/>
+                <w:sz w:val="20"/>
+              </w:rPr>
+              <w:t xml:space="preserve">Contrast: familySync is not a function</w:t>
+            </w:r>
+          </w:p>
+        </w:tc>
+        <w:tc>
+          <w:tcPr>
+            <w:tcW w:type="dxa" w:w="4760"/>
+            <w:tcBorders>
+              <w:top w:val="single" w:sz="4" w:color="DDDDDD"/>
+              <w:left w:val="single" w:sz="4" w:color="DDDDDD"/>
+              <w:bottom w:val="single" w:sz="4" w:color="DDDDDD"/>
+              <w:right w:val="single" w:sz="4" w:color="DDDDDD"/>
+            </w:tcBorders>
+            <w:shd w:val="clear" w:color="auto" w:fill="FFFFFF"/>
+            <w:tcMar>
+              <w:top w:w="80" w:type="dxa"/>
+              <w:bottom w:w="80" w:type="dxa"/>
+              <w:left w:w="120" w:type="dxa"/>
+              <w:right w:w="120" w:type="dxa"/>
+            </w:tcMar>
+          </w:tcPr>
+          <w:p>
+            <w:r>
+              <w:rPr>
+                <w:rFonts w:ascii="Arial" w:hAnsi="Arial"/>
+                <w:sz w:val="20"/>
+              </w:rPr>
+              <w:t xml:space="preserve">Module._load monkey-patch injects familySync shim returning "glibc"</w:t>
+            </w:r>
+          </w:p>
+        </w:tc>
+      </w:tr>
+      <w:tr>
+        <w:tc>
+          <w:tcPr>
+            <w:tcW w:type="dxa" w:w="900"/>
+            <w:tcBorders>
+              <w:top w:val="single" w:sz="4" w:color="DDDDDD"/>
+              <w:left w:val="single" w:sz="4" w:color="DDDDDD"/>
+              <w:bottom w:val="single" w:sz="4" w:color="DDDDDD"/>
+              <w:right w:val="single" w:sz="4" w:color="DDDDDD"/>
+            </w:tcBorders>
+            <w:shd w:val="clear" w:color="auto" w:fill="F0F4F8"/>
+            <w:tcMar>
+              <w:top w:w="80" w:type="dxa"/>
+              <w:bottom w:w="80" w:type="dxa"/>
+              <w:left w:w="120" w:type="dxa"/>
+              <w:right w:w="120" w:type="dxa"/>
+            </w:tcMar>
+          </w:tcPr>
+          <w:p>
+            <w:r>
+              <w:rPr>
+                <w:rFonts w:ascii="Arial" w:hAnsi="Arial"/>
+                <w:sz w:val="20"/>
+              </w:rPr>
+              <w:t xml:space="preserve">M4.6</w:t>
+            </w:r>
+          </w:p>
+        </w:tc>
+        <w:tc>
+          <w:tcPr>
+            <w:tcW w:type="dxa" w:w="3700"/>
+            <w:tcBorders>
+              <w:top w:val="single" w:sz="4" w:color="DDDDDD"/>
+              <w:left w:val="single" w:sz="4" w:color="DDDDDD"/>
+              <w:bottom w:val="single" w:sz="4" w:color="DDDDDD"/>
+              <w:right w:val="single" w:sz="4" w:color="DDDDDD"/>
+            </w:tcBorders>
+            <w:shd w:val="clear" w:color="auto" w:fill="F0F4F8"/>
+            <w:tcMar>
+              <w:top w:w="80" w:type="dxa"/>
+              <w:bottom w:w="80" w:type="dxa"/>
+              <w:left w:w="120" w:type="dxa"/>
+              <w:right w:w="120" w:type="dxa"/>
+            </w:tcMar>
+          </w:tcPr>
+          <w:p>
+            <w:r>
+              <w:rPr>
+                <w:rFonts w:ascii="Arial" w:hAnsi="Arial"/>
+                <w:sz w:val="20"/>
+              </w:rPr>
+              <w:t xml:space="preserve">Contrast: fireball-node.linux-arm64-gnu.node missing</w:t>
+            </w:r>
+          </w:p>
+        </w:tc>
+        <w:tc>
+          <w:tcPr>
+            <w:tcW w:type="dxa" w:w="4760"/>
+            <w:tcBorders>
+              <w:top w:val="single" w:sz="4" w:color="DDDDDD"/>
+              <w:left w:val="single" w:sz="4" w:color="DDDDDD"/>
+              <w:bottom w:val="single" w:sz="4" w:color="DDDDDD"/>
+              <w:right w:val="single" w:sz="4" w:color="DDDDDD"/>
+            </w:tcBorders>
+            <w:shd w:val="clear" w:color="auto" w:fill="F0F4F8"/>
+            <w:tcMar>
+              <w:top w:w="80" w:type="dxa"/>
+              <w:bottom w:w="80" w:type="dxa"/>
+              <w:left w:w="120" w:type="dxa"/>
+              <w:right w:w="120" w:type="dxa"/>
+            </w:tcMar>
+          </w:tcPr>
+          <w:p>
+            <w:r>
+              <w:rPr>
+                <w:rFonts w:ascii="Arial" w:hAnsi="Arial"/>
+                <w:sz w:val="20"/>
+              </w:rPr>
+              <w:t xml:space="preserve">No fix — @contrast/rasp-v3@0.7.0-alpha.5 incompatible on ARM64 + Node 24</w:t>
+            </w:r>
+          </w:p>
+        </w:tc>
+      </w:tr>
+      <w:tr>
+        <w:tc>
+          <w:tcPr>
+            <w:tcW w:type="dxa" w:w="900"/>
+            <w:tcBorders>
+              <w:top w:val="single" w:sz="4" w:color="DDDDDD"/>
+              <w:left w:val="single" w:sz="4" w:color="DDDDDD"/>
+              <w:bottom w:val="single" w:sz="4" w:color="DDDDDD"/>
+              <w:right w:val="single" w:sz="4" w:color="DDDDDD"/>
+            </w:tcBorders>
+            <w:shd w:val="clear" w:color="auto" w:fill="FFFFFF"/>
+            <w:tcMar>
+              <w:top w:w="80" w:type="dxa"/>
+              <w:bottom w:w="80" w:type="dxa"/>
+              <w:left w:w="120" w:type="dxa"/>
+              <w:right w:w="120" w:type="dxa"/>
+            </w:tcMar>
+          </w:tcPr>
+          <w:p>
+            <w:r>
+              <w:rPr>
+                <w:rFonts w:ascii="Arial" w:hAnsi="Arial"/>
+                <w:sz w:val="20"/>
+              </w:rPr>
+              <w:t xml:space="preserve">M4.6</w:t>
+            </w:r>
+          </w:p>
+        </w:tc>
+        <w:tc>
+          <w:tcPr>
+            <w:tcW w:type="dxa" w:w="3700"/>
+            <w:tcBorders>
+              <w:top w:val="single" w:sz="4" w:color="DDDDDD"/>
+              <w:left w:val="single" w:sz="4" w:color="DDDDDD"/>
+              <w:bottom w:val="single" w:sz="4" w:color="DDDDDD"/>
+              <w:right w:val="single" w:sz="4" w:color="DDDDDD"/>
+            </w:tcBorders>
+            <w:shd w:val="clear" w:color="auto" w:fill="FFFFFF"/>
+            <w:tcMar>
+              <w:top w:w="80" w:type="dxa"/>
+              <w:bottom w:w="80" w:type="dxa"/>
+              <w:left w:w="120" w:type="dxa"/>
+              <w:right w:w="120" w:type="dxa"/>
+            </w:tcMar>
+          </w:tcPr>
+          <w:p>
+            <w:r>
+              <w:rPr>
+                <w:rFonts w:ascii="Arial" w:hAnsi="Arial"/>
+                <w:sz w:val="20"/>
+              </w:rPr>
+              <w:t xml:space="preserve">Datadog: libddwaf not loading (no wafVersion in startup log)</w:t>
+            </w:r>
+          </w:p>
+        </w:tc>
+        <w:tc>
+          <w:tcPr>
+            <w:tcW w:type="dxa" w:w="4760"/>
+            <w:tcBorders>
+              <w:top w:val="single" w:sz="4" w:color="DDDDDD"/>
+              <w:left w:val="single" w:sz="4" w:color="DDDDDD"/>
+              <w:bottom w:val="single" w:sz="4" w:color="DDDDDD"/>
+              <w:right w:val="single" w:sz="4" w:color="DDDDDD"/>
+            </w:tcBorders>
+            <w:shd w:val="clear" w:color="auto" w:fill="FFFFFF"/>
+            <w:tcMar>
+              <w:top w:w="80" w:type="dxa"/>
+              <w:bottom w:w="80" w:type="dxa"/>
+              <w:left w:w="120" w:type="dxa"/>
+              <w:right w:w="120" w:type="dxa"/>
+            </w:tcMar>
+          </w:tcPr>
+          <w:p>
+            <w:r>
+              <w:rPr>
+                <w:rFonts w:ascii="Arial" w:hAnsi="Arial"/>
+                <w:sz w:val="20"/>
+              </w:rPr>
+              <w:t xml:space="preserve">Install detect-libc@1 in Dockerfile builder — node-gyp-build needs it to construct linuxglibc-arm64 path</w:t>
+            </w:r>
+          </w:p>
+        </w:tc>
+      </w:tr>
+      <w:tr>
+        <w:tc>
+          <w:tcPr>
+            <w:tcW w:type="dxa" w:w="900"/>
+            <w:tcBorders>
+              <w:top w:val="single" w:sz="4" w:color="DDDDDD"/>
+              <w:left w:val="single" w:sz="4" w:color="DDDDDD"/>
+              <w:bottom w:val="single" w:sz="4" w:color="DDDDDD"/>
+              <w:right w:val="single" w:sz="4" w:color="DDDDDD"/>
+            </w:tcBorders>
+            <w:shd w:val="clear" w:color="auto" w:fill="F0F4F8"/>
+            <w:tcMar>
+              <w:top w:w="80" w:type="dxa"/>
+              <w:bottom w:w="80" w:type="dxa"/>
+              <w:left w:w="120" w:type="dxa"/>
+              <w:right w:w="120" w:type="dxa"/>
+            </w:tcMar>
+          </w:tcPr>
+          <w:p>
+            <w:r>
+              <w:rPr>
+                <w:rFonts w:ascii="Arial" w:hAnsi="Arial"/>
+                <w:sz w:val="20"/>
+              </w:rPr>
+              <w:t xml:space="preserve">M4.6</w:t>
+            </w:r>
+          </w:p>
+        </w:tc>
+        <w:tc>
+          <w:tcPr>
+            <w:tcW w:type="dxa" w:w="3700"/>
+            <w:tcBorders>
+              <w:top w:val="single" w:sz="4" w:color="DDDDDD"/>
+              <w:left w:val="single" w:sz="4" w:color="DDDDDD"/>
+              <w:bottom w:val="single" w:sz="4" w:color="DDDDDD"/>
+              <w:right w:val="single" w:sz="4" w:color="DDDDDD"/>
+            </w:tcBorders>
+            <w:shd w:val="clear" w:color="auto" w:fill="F0F4F8"/>
+            <w:tcMar>
+              <w:top w:w="80" w:type="dxa"/>
+              <w:bottom w:w="80" w:type="dxa"/>
+              <w:left w:w="120" w:type="dxa"/>
+              <w:right w:w="120" w:type="dxa"/>
+            </w:tcMar>
+          </w:tcPr>
+          <w:p>
+            <w:r>
+              <w:rPr>
+                <w:rFonts w:ascii="Arial" w:hAnsi="Arial"/>
+                <w:sz w:val="20"/>
+              </w:rPr>
+              <w:t xml:space="preserve">Datadog: dd-trace v5 returns 500 on attacks</w:t>
+            </w:r>
+          </w:p>
+        </w:tc>
+        <w:tc>
+          <w:tcPr>
+            <w:tcW w:type="dxa" w:w="4760"/>
+            <w:tcBorders>
+              <w:top w:val="single" w:sz="4" w:color="DDDDDD"/>
+              <w:left w:val="single" w:sz="4" w:color="DDDDDD"/>
+              <w:bottom w:val="single" w:sz="4" w:color="DDDDDD"/>
+              <w:right w:val="single" w:sz="4" w:color="DDDDDD"/>
+            </w:tcBorders>
+            <w:shd w:val="clear" w:color="auto" w:fill="F0F4F8"/>
+            <w:tcMar>
+              <w:top w:w="80" w:type="dxa"/>
+              <w:bottom w:w="80" w:type="dxa"/>
+              <w:left w:w="120" w:type="dxa"/>
+              <w:right w:w="120" w:type="dxa"/>
+            </w:tcMar>
+          </w:tcPr>
+          <w:p>
+            <w:r>
+              <w:rPr>
+                <w:rFonts w:ascii="Arial" w:hAnsi="Arial"/>
+                <w:sz w:val="20"/>
+              </w:rPr>
+              <w:t xml:space="preserve">Pin to dd-trace@4 — v5 WAF rules require connected Datadog agent</w:t>
+            </w:r>
+          </w:p>
+        </w:tc>
+      </w:tr>
+      <w:tr>
+        <w:tc>
+          <w:tcPr>
+            <w:tcW w:type="dxa" w:w="900"/>
+            <w:tcBorders>
+              <w:top w:val="single" w:sz="4" w:color="DDDDDD"/>
+              <w:left w:val="single" w:sz="4" w:color="DDDDDD"/>
+              <w:bottom w:val="single" w:sz="4" w:color="DDDDDD"/>
+              <w:right w:val="single" w:sz="4" w:color="DDDDDD"/>
+            </w:tcBorders>
+            <w:shd w:val="clear" w:color="auto" w:fill="FFFFFF"/>
+            <w:tcMar>
+              <w:top w:w="80" w:type="dxa"/>
+              <w:bottom w:w="80" w:type="dxa"/>
+              <w:left w:w="120" w:type="dxa"/>
+              <w:right w:w="120" w:type="dxa"/>
+            </w:tcMar>
+          </w:tcPr>
+          <w:p>
+            <w:r>
+              <w:rPr>
+                <w:rFonts w:ascii="Arial" w:hAnsi="Arial"/>
+                <w:sz w:val="20"/>
+              </w:rPr>
+              <w:t xml:space="preserve">M4.6</w:t>
+            </w:r>
+          </w:p>
+        </w:tc>
+        <w:tc>
+          <w:tcPr>
+            <w:tcW w:type="dxa" w:w="3700"/>
+            <w:tcBorders>
+              <w:top w:val="single" w:sz="4" w:color="DDDDDD"/>
+              <w:left w:val="single" w:sz="4" w:color="DDDDDD"/>
+              <w:bottom w:val="single" w:sz="4" w:color="DDDDDD"/>
+              <w:right w:val="single" w:sz="4" w:color="DDDDDD"/>
+            </w:tcBorders>
+            <w:shd w:val="clear" w:color="auto" w:fill="FFFFFF"/>
+            <w:tcMar>
+              <w:top w:w="80" w:type="dxa"/>
+              <w:bottom w:w="80" w:type="dxa"/>
+              <w:left w:w="120" w:type="dxa"/>
+              <w:right w:w="120" w:type="dxa"/>
+            </w:tcMar>
+          </w:tcPr>
+          <w:p>
+            <w:r>
+              <w:rPr>
+                <w:rFonts w:ascii="Arial" w:hAnsi="Arial"/>
+                <w:sz w:val="20"/>
+              </w:rPr>
+              <w:t xml:space="preserve">Datadog: WAF detects attack but returns 500 not 403</w:t>
+            </w:r>
+          </w:p>
+        </w:tc>
+        <w:tc>
+          <w:tcPr>
+            <w:tcW w:type="dxa" w:w="4760"/>
+            <w:tcBorders>
+              <w:top w:val="single" w:sz="4" w:color="DDDDDD"/>
+              <w:left w:val="single" w:sz="4" w:color="DDDDDD"/>
+              <w:bottom w:val="single" w:sz="4" w:color="DDDDDD"/>
+              <w:right w:val="single" w:sz="4" w:color="DDDDDD"/>
+            </w:tcBorders>
+            <w:shd w:val="clear" w:color="auto" w:fill="FFFFFF"/>
+            <w:tcMar>
+              <w:top w:w="80" w:type="dxa"/>
+              <w:bottom w:w="80" w:type="dxa"/>
+              <w:left w:w="120" w:type="dxa"/>
+              <w:right w:w="120" w:type="dxa"/>
+            </w:tcMar>
+          </w:tcPr>
+          <w:p>
+            <w:r>
+              <w:rPr>
+                <w:rFonts w:ascii="Arial" w:hAnsi="Arial"/>
+                <w:sz w:val="20"/>
+              </w:rPr>
+              <w:t xml:space="preserve">Create dd-blocking-rules.json with on_match:[block] and set DD_APPSEC_RULES</w:t>
+            </w:r>
+          </w:p>
+        </w:tc>
+      </w:tr>
+      <w:tr>
+        <w:tc>
+          <w:tcPr>
+            <w:tcW w:type="dxa" w:w="900"/>
+            <w:tcBorders>
+              <w:top w:val="single" w:sz="4" w:color="DDDDDD"/>
+              <w:left w:val="single" w:sz="4" w:color="DDDDDD"/>
+              <w:bottom w:val="single" w:sz="4" w:color="DDDDDD"/>
+              <w:right w:val="single" w:sz="4" w:color="DDDDDD"/>
+            </w:tcBorders>
+            <w:shd w:val="clear" w:color="auto" w:fill="F0F4F8"/>
+            <w:tcMar>
+              <w:top w:w="80" w:type="dxa"/>
+              <w:bottom w:w="80" w:type="dxa"/>
+              <w:left w:w="120" w:type="dxa"/>
+              <w:right w:w="120" w:type="dxa"/>
+            </w:tcMar>
+          </w:tcPr>
+          <w:p>
+            <w:r>
+              <w:rPr>
+                <w:rFonts w:ascii="Arial" w:hAnsi="Arial"/>
+                <w:sz w:val="20"/>
+              </w:rPr>
+              <w:t xml:space="preserve">M4.6</w:t>
+            </w:r>
+          </w:p>
+        </w:tc>
+        <w:tc>
+          <w:tcPr>
+            <w:tcW w:type="dxa" w:w="3700"/>
+            <w:tcBorders>
+              <w:top w:val="single" w:sz="4" w:color="DDDDDD"/>
+              <w:left w:val="single" w:sz="4" w:color="DDDDDD"/>
+              <w:bottom w:val="single" w:sz="4" w:color="DDDDDD"/>
+              <w:right w:val="single" w:sz="4" w:color="DDDDDD"/>
+            </w:tcBorders>
+            <w:shd w:val="clear" w:color="auto" w:fill="F0F4F8"/>
+            <w:tcMar>
+              <w:top w:w="80" w:type="dxa"/>
+              <w:bottom w:w="80" w:type="dxa"/>
+              <w:left w:w="120" w:type="dxa"/>
+              <w:right w:w="120" w:type="dxa"/>
+            </w:tcMar>
+          </w:tcPr>
+          <w:p>
+            <w:r>
+              <w:rPr>
+                <w:rFonts w:ascii="Arial" w:hAnsi="Arial"/>
+                <w:sz w:val="20"/>
+              </w:rPr>
+              <w:t xml:space="preserve">docker cp into distroless container → EACCES</w:t>
+            </w:r>
+          </w:p>
+        </w:tc>
+        <w:tc>
+          <w:tcPr>
+            <w:tcW w:type="dxa" w:w="4760"/>
+            <w:tcBorders>
+              <w:top w:val="single" w:sz="4" w:color="DDDDDD"/>
+              <w:left w:val="single" w:sz="4" w:color="DDDDDD"/>
+              <w:bottom w:val="single" w:sz="4" w:color="DDDDDD"/>
+              <w:right w:val="single" w:sz="4" w:color="DDDDDD"/>
+            </w:tcBorders>
+            <w:shd w:val="clear" w:color="auto" w:fill="F0F4F8"/>
+            <w:tcMar>
+              <w:top w:w="80" w:type="dxa"/>
+              <w:bottom w:w="80" w:type="dxa"/>
+              <w:left w:w="120" w:type="dxa"/>
+              <w:right w:w="120" w:type="dxa"/>
+            </w:tcMar>
+          </w:tcPr>
+          <w:p>
+            <w:r>
+              <w:rPr>
+                <w:rFonts w:ascii="Arial" w:hAnsi="Arial"/>
+                <w:sz w:val="20"/>
+              </w:rPr>
+              <w:t xml:space="preserve">Rebuild image with COPY --chmod=644 in Dockerfile — never use docker cp</w:t>
             </w:r>
           </w:p>
         </w:tc>
@@ -10824,6 +11820,1451 @@
     </w:p>
     <w:p>
       <w:pPr>
+        <w:pBdr>
+          <w:bottom w:val="single" w:color="1F3864" w:sz="6" w:space="1"/>
+        </w:pBdr>
+        <w:spacing w:after="160"/>
+      </w:pPr>
+      <w:r>
+        <w:t xml:space="preserve"/>
+      </w:r>
+    </w:p>
+    <w:p>
+      <w:r>
+        <w:t xml:space="preserve"/>
+      </w:r>
+    </w:p>
+    <w:p>
+      <w:pPr>
+        <w:pStyle w:val="Heading2"/>
+      </w:pPr>
+      <w:r>
+        <w:rPr>
+          <w:color w:val="1F3864"/>
+        </w:rPr>
+        <w:t xml:space="preserve">Exercise 4.6.3 — Contrast RASP v3 ❌ Incompatible</w:t>
+      </w:r>
+    </w:p>
+    <w:p>
+      <w:pPr>
+        <w:pBdr>
+          <w:top w:val="single" w:color="1F3864" w:sz="4" w:space="1"/>
+          <w:left w:val="single" w:color="1F3864" w:sz="8" w:space="4"/>
+          <w:bottom w:val="single" w:color="1F3864" w:sz="4" w:space="1"/>
+          <w:right w:val="single" w:color="1F3864" w:sz="4" w:space="4"/>
+        </w:pBdr>
+        <w:shd w:fill="EBF3F9" w:val="clear"/>
+      </w:pPr>
+      <w:r>
+        <w:rPr>
+          <w:rFonts w:ascii="Arial" w:hAnsi="Arial"/>
+          <w:b/>
+          <w:sz w:val="20"/>
+          <w:color w:val="1F3864"/>
+        </w:rPr>
+        <w:t xml:space="preserve">Do not run. @contrast/rasp-v3@0.7.0-alpha.5 is incompatible with Apple Silicon (ARM64) + Node.js v24.</w:t>
+      </w:r>
+    </w:p>
+    <w:p>
+      <w:r>
+        <w:rPr>
+          <w:rFonts w:ascii="Arial" w:hAnsi="Arial"/>
+          <w:b/>
+          <w:sz w:val="22"/>
+        </w:rPr>
+        <w:t xml:space="preserve">Three failures were encountered. The first two were resolved; the third is unfixable:</w:t>
+      </w:r>
+    </w:p>
+    <w:p>
+      <w:r>
+        <w:t xml:space="preserve"/>
+      </w:r>
+    </w:p>
+    <w:p>
+      <w:r>
+        <w:rPr>
+          <w:rFonts w:ascii="Arial" w:hAnsi="Arial"/>
+          <w:sz w:val="22"/>
+        </w:rPr>
+        <w:t xml:space="preserve">Failure 1 — require() on ESM graph with top-level await</w:t>
+      </w:r>
+    </w:p>
+    <w:p>
+      <w:r>
+        <w:rPr>
+          <w:rFonts w:ascii="Arial" w:hAnsi="Arial"/>
+          <w:sz w:val="22"/>
+        </w:rPr>
+        <w:t xml:space="preserve">@contrast/rasp-v3 is an ES module. --require cannot load ESM. Fix: --import file:///contrast-rasp-loader.mjs</w:t>
+      </w:r>
+    </w:p>
+    <w:p>
+      <w:r>
+        <w:t xml:space="preserve"/>
+      </w:r>
+    </w:p>
+    <w:p>
+      <w:r>
+        <w:rPr>
+          <w:rFonts w:ascii="Arial" w:hAnsi="Arial"/>
+          <w:sz w:val="22"/>
+        </w:rPr>
+        <w:t xml:space="preserve">Failure 2 — familySync is not a function</w:t>
+      </w:r>
+    </w:p>
+    <w:p>
+      <w:r>
+        <w:rPr>
+          <w:rFonts w:ascii="Arial" w:hAnsi="Arial"/>
+          <w:sz w:val="22"/>
+        </w:rPr>
+        <w:t xml:space="preserve">detect-libc v2 removed the synchronous familySync() API used by @contrast/agent-lib. Fix: Module._load monkey-patch that injects a familySync shim returning "glibc".</w:t>
+      </w:r>
+    </w:p>
+    <w:p>
+      <w:r>
+        <w:t xml:space="preserve"/>
+      </w:r>
+    </w:p>
+    <w:p>
+      <w:r>
+        <w:rPr>
+          <w:rFonts w:ascii="Arial" w:hAnsi="Arial"/>
+          <w:sz w:val="22"/>
+        </w:rPr>
+        <w:t xml:space="preserve">Failure 3 — Cannot find module fireball-node.linux-arm64-gnu.node ❌</w:t>
+      </w:r>
+    </w:p>
+    <w:p>
+      <w:r>
+        <w:rPr>
+          <w:rFonts w:ascii="Arial" w:hAnsi="Arial"/>
+          <w:sz w:val="22"/>
+        </w:rPr>
+        <w:t xml:space="preserve">@contrast/fireball has no prebuilt binary for ARM64 + Node.js v24 in this alpha release. This cannot be worked around. Production alternative: @contrast/agent (commercial, full ARM64 support).</w:t>
+      </w:r>
+    </w:p>
+    <w:p>
+      <w:r>
+        <w:t xml:space="preserve"/>
+      </w:r>
+    </w:p>
+    <w:p>
+      <w:pPr>
+        <w:pStyle w:val="Heading2"/>
+      </w:pPr>
+      <w:r>
+        <w:rPr>
+          <w:color w:val="1F3864"/>
+        </w:rPr>
+        <w:t xml:space="preserve">Exercise 4.6.4 — AppSensor Escalating Response ✅</w:t>
+      </w:r>
+    </w:p>
+    <w:p>
+      <w:r>
+        <w:rPr>
+          <w:rFonts w:ascii="Arial" w:hAnsi="Arial"/>
+          <w:sz w:val="22"/>
+        </w:rPr>
+        <w:t xml:space="preserve">AppSensor implements proportional response: LOG (pass-through) → WARN (HTTP 429) → BLOCK (HTTP 403), keyed per source IP.</w:t>
+      </w:r>
+    </w:p>
+    <w:p>
+      <w:r>
+        <w:t xml:space="preserve"/>
+      </w:r>
+    </w:p>
+    <w:p>
+      <w:pPr>
+        <w:pBdr>
+          <w:top w:val="single" w:color="CCCCCC" w:sz="4" w:space="1"/>
+          <w:left w:val="single" w:color="CCCCCC" w:sz="4" w:space="4"/>
+          <w:bottom w:val="single" w:color="CCCCCC" w:sz="4" w:space="1"/>
+          <w:right w:val="single" w:color="CCCCCC" w:sz="4" w:space="4"/>
+        </w:pBdr>
+        <w:shd w:fill="F5F5F5" w:val="clear"/>
+        <w:spacing w:after="160"/>
+      </w:pPr>
+      <w:r>
+        <w:rPr>
+          <w:rFonts w:ascii="Courier New" w:hAnsi="Courier New"/>
+          <w:sz w:val="18"/>
+        </w:rPr>
+        <w:t xml:space="preserve">docker compose --profile appsensor build</w:t>
+      </w:r>
+      <w:r>
+        <w:rPr>
+          <w:rFonts w:ascii="Courier New" w:hAnsi="Courier New"/>
+          <w:sz w:val="18"/>
+        </w:rPr>
+        <w:br/>
+      </w:r>
+      <w:r>
+        <w:rPr>
+          <w:rFonts w:ascii="Courier New" w:hAnsi="Courier New"/>
+          <w:sz w:val="18"/>
+        </w:rPr>
+        <w:t xml:space="preserve">docker compose --profile appsensor up -d</w:t>
+      </w:r>
+      <w:r>
+        <w:rPr>
+          <w:rFonts w:ascii="Courier New" w:hAnsi="Courier New"/>
+          <w:sz w:val="18"/>
+        </w:rPr>
+        <w:br/>
+      </w:r>
+      <w:r>
+        <w:rPr>
+          <w:rFonts w:ascii="Courier New" w:hAnsi="Courier New"/>
+          <w:sz w:val="18"/>
+        </w:rPr>
+        <w:t xml:space="preserve">sleep 20</w:t>
+      </w:r>
+      <w:r>
+        <w:rPr>
+          <w:rFonts w:ascii="Courier New" w:hAnsi="Courier New"/>
+          <w:sz w:val="18"/>
+        </w:rPr>
+        <w:br/>
+      </w:r>
+      <w:r>
+        <w:rPr>
+          <w:rFonts w:ascii="Courier New" w:hAnsi="Courier New"/>
+          <w:sz w:val="18"/>
+        </w:rPr>
+        <w:t xml:space="preserve"/>
+      </w:r>
+      <w:r>
+        <w:rPr>
+          <w:rFonts w:ascii="Courier New" w:hAnsi="Courier New"/>
+          <w:sz w:val="18"/>
+        </w:rPr>
+        <w:br/>
+      </w:r>
+      <w:r>
+        <w:rPr>
+          <w:rFonts w:ascii="Courier New" w:hAnsi="Courier New"/>
+          <w:sz w:val="18"/>
+        </w:rPr>
+        <w:t xml:space="preserve">for i in {1..6}; do</w:t>
+      </w:r>
+      <w:r>
+        <w:rPr>
+          <w:rFonts w:ascii="Courier New" w:hAnsi="Courier New"/>
+          <w:sz w:val="18"/>
+        </w:rPr>
+        <w:br/>
+      </w:r>
+      <w:r>
+        <w:rPr>
+          <w:rFonts w:ascii="Courier New" w:hAnsi="Courier New"/>
+          <w:sz w:val="18"/>
+        </w:rPr>
+        <w:t xml:space="preserve">  echo -n "Hit $i: "</w:t>
+      </w:r>
+      <w:r>
+        <w:rPr>
+          <w:rFonts w:ascii="Courier New" w:hAnsi="Courier New"/>
+          <w:sz w:val="18"/>
+        </w:rPr>
+        <w:br/>
+      </w:r>
+      <w:r>
+        <w:rPr>
+          <w:rFonts w:ascii="Courier New" w:hAnsi="Courier New"/>
+          <w:sz w:val="18"/>
+        </w:rPr>
+        <w:t xml:space="preserve">  curl -s -o /dev/null -w "%{http_code}" \</w:t>
+      </w:r>
+      <w:r>
+        <w:rPr>
+          <w:rFonts w:ascii="Courier New" w:hAnsi="Courier New"/>
+          <w:sz w:val="18"/>
+        </w:rPr>
+        <w:br/>
+      </w:r>
+      <w:r>
+        <w:rPr>
+          <w:rFonts w:ascii="Courier New" w:hAnsi="Courier New"/>
+          <w:sz w:val="18"/>
+        </w:rPr>
+        <w:t xml:space="preserve">    "http://localhost:3004/rest/products/search?q=%27+OR+1%3D1--"</w:t>
+      </w:r>
+      <w:r>
+        <w:rPr>
+          <w:rFonts w:ascii="Courier New" w:hAnsi="Courier New"/>
+          <w:sz w:val="18"/>
+        </w:rPr>
+        <w:br/>
+      </w:r>
+      <w:r>
+        <w:rPr>
+          <w:rFonts w:ascii="Courier New" w:hAnsi="Courier New"/>
+          <w:sz w:val="18"/>
+        </w:rPr>
+        <w:t xml:space="preserve">  echo</w:t>
+      </w:r>
+      <w:r>
+        <w:rPr>
+          <w:rFonts w:ascii="Courier New" w:hAnsi="Courier New"/>
+          <w:sz w:val="18"/>
+        </w:rPr>
+        <w:br/>
+      </w:r>
+      <w:r>
+        <w:rPr>
+          <w:rFonts w:ascii="Courier New" w:hAnsi="Courier New"/>
+          <w:sz w:val="18"/>
+        </w:rPr>
+        <w:t xml:space="preserve">done</w:t>
+      </w:r>
+    </w:p>
+    <w:p>
+      <w:r>
+        <w:rPr>
+          <w:rFonts w:ascii="Arial" w:hAnsi="Arial"/>
+          <w:b/>
+          <w:sz w:val="22"/>
+        </w:rPr>
+        <w:t xml:space="preserve">Confirmed output:</w:t>
+      </w:r>
+    </w:p>
+    <w:p>
+      <w:pPr>
+        <w:pBdr>
+          <w:top w:val="single" w:color="CCCCCC" w:sz="4" w:space="1"/>
+          <w:left w:val="single" w:color="CCCCCC" w:sz="4" w:space="4"/>
+          <w:bottom w:val="single" w:color="CCCCCC" w:sz="4" w:space="1"/>
+          <w:right w:val="single" w:color="CCCCCC" w:sz="4" w:space="4"/>
+        </w:pBdr>
+        <w:shd w:fill="F5F5F5" w:val="clear"/>
+        <w:spacing w:after="160"/>
+      </w:pPr>
+      <w:r>
+        <w:rPr>
+          <w:rFonts w:ascii="Courier New" w:hAnsi="Courier New"/>
+          <w:sz w:val="18"/>
+        </w:rPr>
+        <w:t xml:space="preserve">Hit 1: 500  (LOG — AppSensor passes through; SQLite throws on malicious query)</w:t>
+      </w:r>
+      <w:r>
+        <w:rPr>
+          <w:rFonts w:ascii="Courier New" w:hAnsi="Courier New"/>
+          <w:sz w:val="18"/>
+        </w:rPr>
+        <w:br/>
+      </w:r>
+      <w:r>
+        <w:rPr>
+          <w:rFonts w:ascii="Courier New" w:hAnsi="Courier New"/>
+          <w:sz w:val="18"/>
+        </w:rPr>
+        <w:t xml:space="preserve">Hit 2: 429  (WARN — IE2 fires multiple times per HTTP request on Juice Shop)</w:t>
+      </w:r>
+      <w:r>
+        <w:rPr>
+          <w:rFonts w:ascii="Courier New" w:hAnsi="Courier New"/>
+          <w:sz w:val="18"/>
+        </w:rPr>
+        <w:br/>
+      </w:r>
+      <w:r>
+        <w:rPr>
+          <w:rFonts w:ascii="Courier New" w:hAnsi="Courier New"/>
+          <w:sz w:val="18"/>
+        </w:rPr>
+        <w:t xml:space="preserve">Hit 3: 429</w:t>
+      </w:r>
+      <w:r>
+        <w:rPr>
+          <w:rFonts w:ascii="Courier New" w:hAnsi="Courier New"/>
+          <w:sz w:val="18"/>
+        </w:rPr>
+        <w:br/>
+      </w:r>
+      <w:r>
+        <w:rPr>
+          <w:rFonts w:ascii="Courier New" w:hAnsi="Courier New"/>
+          <w:sz w:val="18"/>
+        </w:rPr>
+        <w:t xml:space="preserve">Hit 4: 429</w:t>
+      </w:r>
+      <w:r>
+        <w:rPr>
+          <w:rFonts w:ascii="Courier New" w:hAnsi="Courier New"/>
+          <w:sz w:val="18"/>
+        </w:rPr>
+        <w:br/>
+      </w:r>
+      <w:r>
+        <w:rPr>
+          <w:rFonts w:ascii="Courier New" w:hAnsi="Courier New"/>
+          <w:sz w:val="18"/>
+        </w:rPr>
+        <w:t xml:space="preserve">Hit 5: 403  (BLOCK)</w:t>
+      </w:r>
+      <w:r>
+        <w:rPr>
+          <w:rFonts w:ascii="Courier New" w:hAnsi="Courier New"/>
+          <w:sz w:val="18"/>
+        </w:rPr>
+        <w:br/>
+      </w:r>
+      <w:r>
+        <w:rPr>
+          <w:rFonts w:ascii="Courier New" w:hAnsi="Courier New"/>
+          <w:sz w:val="18"/>
+        </w:rPr>
+        <w:t xml:space="preserve">Hit 6: 403</w:t>
+      </w:r>
+    </w:p>
+    <w:p>
+      <w:r>
+        <w:rPr>
+          <w:rFonts w:ascii="Arial" w:hAnsi="Arial"/>
+          <w:sz w:val="22"/>
+        </w:rPr>
+        <w:t xml:space="preserve">View AppSensor log output:</w:t>
+      </w:r>
+    </w:p>
+    <w:p>
+      <w:pPr>
+        <w:pBdr>
+          <w:top w:val="single" w:color="CCCCCC" w:sz="4" w:space="1"/>
+          <w:left w:val="single" w:color="CCCCCC" w:sz="4" w:space="4"/>
+          <w:bottom w:val="single" w:color="CCCCCC" w:sz="4" w:space="1"/>
+          <w:right w:val="single" w:color="CCCCCC" w:sz="4" w:space="4"/>
+        </w:pBdr>
+        <w:shd w:fill="F5F5F5" w:val="clear"/>
+        <w:spacing w:after="160"/>
+      </w:pPr>
+      <w:r>
+        <w:rPr>
+          <w:rFonts w:ascii="Courier New" w:hAnsi="Courier New"/>
+          <w:sz w:val="18"/>
+        </w:rPr>
+        <w:t xml:space="preserve">docker compose logs -f juice-shop-appsensor | grep AppSensor</w:t>
+      </w:r>
+    </w:p>
+    <w:p>
+      <w:r>
+        <w:t xml:space="preserve"/>
+      </w:r>
+    </w:p>
+    <w:p>
+      <w:pPr>
+        <w:pStyle w:val="Heading2"/>
+      </w:pPr>
+      <w:r>
+        <w:rPr>
+          <w:color w:val="1F3864"/>
+        </w:rPr>
+        <w:t xml:space="preserve">Exercise 4.6.5 — Datadog ASM ✅ 403 Confirmed</w:t>
+      </w:r>
+    </w:p>
+    <w:p>
+      <w:pPr>
+        <w:pBdr>
+          <w:top w:val="single" w:color="1F3864" w:sz="4" w:space="1"/>
+          <w:left w:val="single" w:color="1F3864" w:sz="8" w:space="4"/>
+          <w:bottom w:val="single" w:color="1F3864" w:sz="4" w:space="1"/>
+          <w:right w:val="single" w:color="1F3864" w:sz="4" w:space="4"/>
+        </w:pBdr>
+        <w:shd w:fill="EBF3F9" w:val="clear"/>
+      </w:pPr>
+      <w:r>
+        <w:rPr>
+          <w:rFonts w:ascii="Arial" w:hAnsi="Arial"/>
+          <w:b/>
+          <w:sz w:val="20"/>
+          <w:color w:val="1F3864"/>
+        </w:rPr>
+        <w:t xml:space="preserve">Blocking works locally without a Datadog account. DD_API_KEY is only needed for the cloud dashboard.</w:t>
+      </w:r>
+    </w:p>
+    <w:p>
+      <w:r>
+        <w:t xml:space="preserve"/>
+      </w:r>
+    </w:p>
+    <w:p>
+      <w:pPr>
+        <w:pBdr>
+          <w:top w:val="single" w:color="CCCCCC" w:sz="4" w:space="1"/>
+          <w:left w:val="single" w:color="CCCCCC" w:sz="4" w:space="4"/>
+          <w:bottom w:val="single" w:color="CCCCCC" w:sz="4" w:space="1"/>
+          <w:right w:val="single" w:color="CCCCCC" w:sz="4" w:space="4"/>
+        </w:pBdr>
+        <w:shd w:fill="F5F5F5" w:val="clear"/>
+        <w:spacing w:after="160"/>
+      </w:pPr>
+      <w:r>
+        <w:rPr>
+          <w:rFonts w:ascii="Courier New" w:hAnsi="Courier New"/>
+          <w:sz w:val="18"/>
+        </w:rPr>
+        <w:t xml:space="preserve">docker compose --profile datadog-asm build</w:t>
+      </w:r>
+      <w:r>
+        <w:rPr>
+          <w:rFonts w:ascii="Courier New" w:hAnsi="Courier New"/>
+          <w:sz w:val="18"/>
+        </w:rPr>
+        <w:br/>
+      </w:r>
+      <w:r>
+        <w:rPr>
+          <w:rFonts w:ascii="Courier New" w:hAnsi="Courier New"/>
+          <w:sz w:val="18"/>
+        </w:rPr>
+        <w:t xml:space="preserve">docker compose --profile datadog-asm up -d</w:t>
+      </w:r>
+      <w:r>
+        <w:rPr>
+          <w:rFonts w:ascii="Courier New" w:hAnsi="Courier New"/>
+          <w:sz w:val="18"/>
+        </w:rPr>
+        <w:br/>
+      </w:r>
+      <w:r>
+        <w:rPr>
+          <w:rFonts w:ascii="Courier New" w:hAnsi="Courier New"/>
+          <w:sz w:val="18"/>
+        </w:rPr>
+        <w:t xml:space="preserve">sleep 25</w:t>
+      </w:r>
+    </w:p>
+    <w:p>
+      <w:r>
+        <w:rPr>
+          <w:rFonts w:ascii="Arial" w:hAnsi="Arial"/>
+          <w:sz w:val="22"/>
+        </w:rPr>
+        <w:t xml:space="preserve">Test blocking (all should return 403 except clean search):</w:t>
+      </w:r>
+    </w:p>
+    <w:p>
+      <w:pPr>
+        <w:pBdr>
+          <w:top w:val="single" w:color="CCCCCC" w:sz="4" w:space="1"/>
+          <w:left w:val="single" w:color="CCCCCC" w:sz="4" w:space="4"/>
+          <w:bottom w:val="single" w:color="CCCCCC" w:sz="4" w:space="1"/>
+          <w:right w:val="single" w:color="CCCCCC" w:sz="4" w:space="4"/>
+        </w:pBdr>
+        <w:shd w:fill="F5F5F5" w:val="clear"/>
+        <w:spacing w:after="160"/>
+      </w:pPr>
+      <w:r>
+        <w:rPr>
+          <w:rFonts w:ascii="Courier New" w:hAnsi="Courier New"/>
+          <w:sz w:val="18"/>
+        </w:rPr>
+        <w:t xml:space="preserve">curl -s -o /dev/null -w "SQLi:  %{http_code}\n" \</w:t>
+      </w:r>
+      <w:r>
+        <w:rPr>
+          <w:rFonts w:ascii="Courier New" w:hAnsi="Courier New"/>
+          <w:sz w:val="18"/>
+        </w:rPr>
+        <w:br/>
+      </w:r>
+      <w:r>
+        <w:rPr>
+          <w:rFonts w:ascii="Courier New" w:hAnsi="Courier New"/>
+          <w:sz w:val="18"/>
+        </w:rPr>
+        <w:t xml:space="preserve">  "http://localhost:3005/rest/products/search?q=%27+OR+1%3D1--"</w:t>
+      </w:r>
+      <w:r>
+        <w:rPr>
+          <w:rFonts w:ascii="Courier New" w:hAnsi="Courier New"/>
+          <w:sz w:val="18"/>
+        </w:rPr>
+        <w:br/>
+      </w:r>
+      <w:r>
+        <w:rPr>
+          <w:rFonts w:ascii="Courier New" w:hAnsi="Courier New"/>
+          <w:sz w:val="18"/>
+        </w:rPr>
+        <w:t xml:space="preserve"/>
+      </w:r>
+      <w:r>
+        <w:rPr>
+          <w:rFonts w:ascii="Courier New" w:hAnsi="Courier New"/>
+          <w:sz w:val="18"/>
+        </w:rPr>
+        <w:br/>
+      </w:r>
+      <w:r>
+        <w:rPr>
+          <w:rFonts w:ascii="Courier New" w:hAnsi="Courier New"/>
+          <w:sz w:val="18"/>
+        </w:rPr>
+        <w:t xml:space="preserve">curl -s -o /dev/null -w "XSS:   %{http_code}\n" \</w:t>
+      </w:r>
+      <w:r>
+        <w:rPr>
+          <w:rFonts w:ascii="Courier New" w:hAnsi="Courier New"/>
+          <w:sz w:val="18"/>
+        </w:rPr>
+        <w:br/>
+      </w:r>
+      <w:r>
+        <w:rPr>
+          <w:rFonts w:ascii="Courier New" w:hAnsi="Courier New"/>
+          <w:sz w:val="18"/>
+        </w:rPr>
+        <w:t xml:space="preserve">  "http://localhost:3005/rest/products/search?q=%3Cscript%3Ealert(1)%3C%2Fscript%3E"</w:t>
+      </w:r>
+      <w:r>
+        <w:rPr>
+          <w:rFonts w:ascii="Courier New" w:hAnsi="Courier New"/>
+          <w:sz w:val="18"/>
+        </w:rPr>
+        <w:br/>
+      </w:r>
+      <w:r>
+        <w:rPr>
+          <w:rFonts w:ascii="Courier New" w:hAnsi="Courier New"/>
+          <w:sz w:val="18"/>
+        </w:rPr>
+        <w:t xml:space="preserve"/>
+      </w:r>
+      <w:r>
+        <w:rPr>
+          <w:rFonts w:ascii="Courier New" w:hAnsi="Courier New"/>
+          <w:sz w:val="18"/>
+        </w:rPr>
+        <w:br/>
+      </w:r>
+      <w:r>
+        <w:rPr>
+          <w:rFonts w:ascii="Courier New" w:hAnsi="Courier New"/>
+          <w:sz w:val="18"/>
+        </w:rPr>
+        <w:t xml:space="preserve">curl -s -o /dev/null -w "LFI:   %{http_code}\n" \</w:t>
+      </w:r>
+      <w:r>
+        <w:rPr>
+          <w:rFonts w:ascii="Courier New" w:hAnsi="Courier New"/>
+          <w:sz w:val="18"/>
+        </w:rPr>
+        <w:br/>
+      </w:r>
+      <w:r>
+        <w:rPr>
+          <w:rFonts w:ascii="Courier New" w:hAnsi="Courier New"/>
+          <w:sz w:val="18"/>
+        </w:rPr>
+        <w:t xml:space="preserve">  "http://localhost:3005/rest/products/search?q=..%2F..%2Fetc%2Fpasswd"</w:t>
+      </w:r>
+      <w:r>
+        <w:rPr>
+          <w:rFonts w:ascii="Courier New" w:hAnsi="Courier New"/>
+          <w:sz w:val="18"/>
+        </w:rPr>
+        <w:br/>
+      </w:r>
+      <w:r>
+        <w:rPr>
+          <w:rFonts w:ascii="Courier New" w:hAnsi="Courier New"/>
+          <w:sz w:val="18"/>
+        </w:rPr>
+        <w:t xml:space="preserve"/>
+      </w:r>
+      <w:r>
+        <w:rPr>
+          <w:rFonts w:ascii="Courier New" w:hAnsi="Courier New"/>
+          <w:sz w:val="18"/>
+        </w:rPr>
+        <w:br/>
+      </w:r>
+      <w:r>
+        <w:rPr>
+          <w:rFonts w:ascii="Courier New" w:hAnsi="Courier New"/>
+          <w:sz w:val="18"/>
+        </w:rPr>
+        <w:t xml:space="preserve">curl -s -o /dev/null -w "clean: %{http_code}\n" \</w:t>
+      </w:r>
+      <w:r>
+        <w:rPr>
+          <w:rFonts w:ascii="Courier New" w:hAnsi="Courier New"/>
+          <w:sz w:val="18"/>
+        </w:rPr>
+        <w:br/>
+      </w:r>
+      <w:r>
+        <w:rPr>
+          <w:rFonts w:ascii="Courier New" w:hAnsi="Courier New"/>
+          <w:sz w:val="18"/>
+        </w:rPr>
+        <w:t xml:space="preserve">  "http://localhost:3005/rest/products/search?q=apple"</w:t>
+      </w:r>
+    </w:p>
+    <w:tbl>
+      <w:tblPr>
+        <w:tblStyle w:val="TableGrid"/>
+        <w:tblW w:type="dxa" w:w="9360"/>
+        <w:tblLook w:firstColumn="1" w:firstRow="1" w:lastColumn="0" w:lastRow="0" w:noHBand="0" w:noVBand="1" w:val="04A0"/>
+      </w:tblPr>
+      <w:tblGrid>
+        <w:gridCol w:w="2200"/>
+        <w:gridCol w:w="1800"/>
+        <w:gridCol w:w="1800"/>
+        <w:gridCol w:w="3560"/>
+      </w:tblGrid>
+      <w:tr>
+        <w:tc>
+          <w:tcPr>
+            <w:tcW w:type="dxa" w:w="2200"/>
+            <w:shd w:val="clear" w:color="auto" w:fill="1F3864"/>
+            <w:tcMar>
+              <w:top w:w="80" w:type="dxa"/>
+              <w:bottom w:w="80" w:type="dxa"/>
+              <w:left w:w="120" w:type="dxa"/>
+              <w:right w:w="120" w:type="dxa"/>
+            </w:tcMar>
+            <w:tcBorders>
+              <w:top w:val="single" w:sz="4" w:color="BBBBBB"/>
+              <w:left w:val="single" w:sz="4" w:color="BBBBBB"/>
+              <w:bottom w:val="single" w:sz="4" w:color="BBBBBB"/>
+              <w:right w:val="single" w:sz="4" w:color="BBBBBB"/>
+            </w:tcBorders>
+          </w:tcPr>
+          <w:p>
+            <w:r>
+              <w:rPr>
+                <w:b/>
+                <w:color w:val="FFFFFF"/>
+                <w:sz w:val="20"/>
+              </w:rPr>
+              <w:t xml:space="preserve">Payload</w:t>
+            </w:r>
+          </w:p>
+        </w:tc>
+        <w:tc>
+          <w:tcPr>
+            <w:tcW w:type="dxa" w:w="1800"/>
+            <w:shd w:val="clear" w:color="auto" w:fill="1F3864"/>
+            <w:tcMar>
+              <w:top w:w="80" w:type="dxa"/>
+              <w:bottom w:w="80" w:type="dxa"/>
+              <w:left w:w="120" w:type="dxa"/>
+              <w:right w:w="120" w:type="dxa"/>
+            </w:tcMar>
+            <w:tcBorders>
+              <w:top w:val="single" w:sz="4" w:color="BBBBBB"/>
+              <w:left w:val="single" w:sz="4" w:color="BBBBBB"/>
+              <w:bottom w:val="single" w:sz="4" w:color="BBBBBB"/>
+              <w:right w:val="single" w:sz="4" w:color="BBBBBB"/>
+            </w:tcBorders>
+          </w:tcPr>
+          <w:p>
+            <w:r>
+              <w:rPr>
+                <w:b/>
+                <w:color w:val="FFFFFF"/>
+                <w:sz w:val="20"/>
+              </w:rPr>
+              <w:t xml:space="preserve">Direct (3000)</w:t>
+            </w:r>
+          </w:p>
+        </w:tc>
+        <w:tc>
+          <w:tcPr>
+            <w:tcW w:type="dxa" w:w="1800"/>
+            <w:shd w:val="clear" w:color="auto" w:fill="1F3864"/>
+            <w:tcMar>
+              <w:top w:w="80" w:type="dxa"/>
+              <w:bottom w:w="80" w:type="dxa"/>
+              <w:left w:w="120" w:type="dxa"/>
+              <w:right w:w="120" w:type="dxa"/>
+            </w:tcMar>
+            <w:tcBorders>
+              <w:top w:val="single" w:sz="4" w:color="BBBBBB"/>
+              <w:left w:val="single" w:sz="4" w:color="BBBBBB"/>
+              <w:bottom w:val="single" w:sz="4" w:color="BBBBBB"/>
+              <w:right w:val="single" w:sz="4" w:color="BBBBBB"/>
+            </w:tcBorders>
+          </w:tcPr>
+          <w:p>
+            <w:r>
+              <w:rPr>
+                <w:b/>
+                <w:color w:val="FFFFFF"/>
+                <w:sz w:val="20"/>
+              </w:rPr>
+              <w:t xml:space="preserve">Protected Port</w:t>
+            </w:r>
+          </w:p>
+        </w:tc>
+        <w:tc>
+          <w:tcPr>
+            <w:tcW w:type="dxa" w:w="3560"/>
+            <w:shd w:val="clear" w:color="auto" w:fill="1F3864"/>
+            <w:tcMar>
+              <w:top w:w="80" w:type="dxa"/>
+              <w:bottom w:w="80" w:type="dxa"/>
+              <w:left w:w="120" w:type="dxa"/>
+              <w:right w:w="120" w:type="dxa"/>
+            </w:tcMar>
+            <w:tcBorders>
+              <w:top w:val="single" w:sz="4" w:color="BBBBBB"/>
+              <w:left w:val="single" w:sz="4" w:color="BBBBBB"/>
+              <w:bottom w:val="single" w:sz="4" w:color="BBBBBB"/>
+              <w:right w:val="single" w:sz="4" w:color="BBBBBB"/>
+            </w:tcBorders>
+          </w:tcPr>
+          <w:p>
+            <w:r>
+              <w:rPr>
+                <w:b/>
+                <w:color w:val="FFFFFF"/>
+                <w:sz w:val="20"/>
+              </w:rPr>
+              <w:t xml:space="preserve">Notes</w:t>
+            </w:r>
+          </w:p>
+        </w:tc>
+      </w:tr>
+      <w:tr>
+        <w:tc>
+          <w:tcPr>
+            <w:tcW w:type="dxa" w:w="2200"/>
+            <w:tcBorders>
+              <w:top w:val="single" w:sz="4" w:color="DDDDDD"/>
+              <w:left w:val="single" w:sz="4" w:color="DDDDDD"/>
+              <w:bottom w:val="single" w:sz="4" w:color="DDDDDD"/>
+              <w:right w:val="single" w:sz="4" w:color="DDDDDD"/>
+            </w:tcBorders>
+            <w:shd w:val="clear" w:color="auto" w:fill="F0F4F8"/>
+            <w:tcMar>
+              <w:top w:w="80" w:type="dxa"/>
+              <w:bottom w:w="80" w:type="dxa"/>
+              <w:left w:w="120" w:type="dxa"/>
+              <w:right w:w="120" w:type="dxa"/>
+            </w:tcMar>
+          </w:tcPr>
+          <w:p>
+            <w:r>
+              <w:rPr>
+                <w:rFonts w:ascii="Arial" w:hAnsi="Arial"/>
+                <w:sz w:val="20"/>
+              </w:rPr>
+              <w:t xml:space="preserve">' OR 1=1--</w:t>
+            </w:r>
+          </w:p>
+        </w:tc>
+        <w:tc>
+          <w:tcPr>
+            <w:tcW w:type="dxa" w:w="1800"/>
+            <w:tcBorders>
+              <w:top w:val="single" w:sz="4" w:color="DDDDDD"/>
+              <w:left w:val="single" w:sz="4" w:color="DDDDDD"/>
+              <w:bottom w:val="single" w:sz="4" w:color="DDDDDD"/>
+              <w:right w:val="single" w:sz="4" w:color="DDDDDD"/>
+            </w:tcBorders>
+            <w:shd w:val="clear" w:color="auto" w:fill="F0F4F8"/>
+            <w:tcMar>
+              <w:top w:w="80" w:type="dxa"/>
+              <w:bottom w:w="80" w:type="dxa"/>
+              <w:left w:w="120" w:type="dxa"/>
+              <w:right w:w="120" w:type="dxa"/>
+            </w:tcMar>
+          </w:tcPr>
+          <w:p>
+            <w:r>
+              <w:rPr>
+                <w:rFonts w:ascii="Arial" w:hAnsi="Arial"/>
+                <w:sz w:val="20"/>
+              </w:rPr>
+              <w:t xml:space="preserve">200 VULNERABLE</w:t>
+            </w:r>
+          </w:p>
+        </w:tc>
+        <w:tc>
+          <w:tcPr>
+            <w:tcW w:type="dxa" w:w="1800"/>
+            <w:tcBorders>
+              <w:top w:val="single" w:sz="4" w:color="DDDDDD"/>
+              <w:left w:val="single" w:sz="4" w:color="DDDDDD"/>
+              <w:bottom w:val="single" w:sz="4" w:color="DDDDDD"/>
+              <w:right w:val="single" w:sz="4" w:color="DDDDDD"/>
+            </w:tcBorders>
+            <w:shd w:val="clear" w:color="auto" w:fill="F0F4F8"/>
+            <w:tcMar>
+              <w:top w:w="80" w:type="dxa"/>
+              <w:bottom w:w="80" w:type="dxa"/>
+              <w:left w:w="120" w:type="dxa"/>
+              <w:right w:w="120" w:type="dxa"/>
+            </w:tcMar>
+          </w:tcPr>
+          <w:p>
+            <w:r>
+              <w:rPr>
+                <w:rFonts w:ascii="Arial" w:hAnsi="Arial"/>
+                <w:sz w:val="20"/>
+              </w:rPr>
+              <w:t xml:space="preserve">403 BLOCKED</w:t>
+            </w:r>
+          </w:p>
+        </w:tc>
+        <w:tc>
+          <w:tcPr>
+            <w:tcW w:type="dxa" w:w="3560"/>
+            <w:tcBorders>
+              <w:top w:val="single" w:sz="4" w:color="DDDDDD"/>
+              <w:left w:val="single" w:sz="4" w:color="DDDDDD"/>
+              <w:bottom w:val="single" w:sz="4" w:color="DDDDDD"/>
+              <w:right w:val="single" w:sz="4" w:color="DDDDDD"/>
+            </w:tcBorders>
+            <w:shd w:val="clear" w:color="auto" w:fill="F0F4F8"/>
+            <w:tcMar>
+              <w:top w:w="80" w:type="dxa"/>
+              <w:bottom w:w="80" w:type="dxa"/>
+              <w:left w:w="120" w:type="dxa"/>
+              <w:right w:w="120" w:type="dxa"/>
+            </w:tcMar>
+          </w:tcPr>
+          <w:p>
+            <w:r>
+              <w:rPr>
+                <w:rFonts w:ascii="Arial" w:hAnsi="Arial"/>
+                <w:sz w:val="20"/>
+              </w:rPr>
+              <w:t xml:space="preserve">SQLi — libinjection operator</w:t>
+            </w:r>
+          </w:p>
+        </w:tc>
+      </w:tr>
+      <w:tr>
+        <w:tc>
+          <w:tcPr>
+            <w:tcW w:type="dxa" w:w="2200"/>
+            <w:tcBorders>
+              <w:top w:val="single" w:sz="4" w:color="DDDDDD"/>
+              <w:left w:val="single" w:sz="4" w:color="DDDDDD"/>
+              <w:bottom w:val="single" w:sz="4" w:color="DDDDDD"/>
+              <w:right w:val="single" w:sz="4" w:color="DDDDDD"/>
+            </w:tcBorders>
+            <w:shd w:val="clear" w:color="auto" w:fill="FFFFFF"/>
+            <w:tcMar>
+              <w:top w:w="80" w:type="dxa"/>
+              <w:bottom w:w="80" w:type="dxa"/>
+              <w:left w:w="120" w:type="dxa"/>
+              <w:right w:w="120" w:type="dxa"/>
+            </w:tcMar>
+          </w:tcPr>
+          <w:p>
+            <w:r>
+              <w:rPr>
+                <w:rFonts w:ascii="Arial" w:hAnsi="Arial"/>
+                <w:sz w:val="20"/>
+              </w:rPr>
+              <w:t xml:space="preserve">&lt;script&gt;alert(1)&lt;/script&gt;</w:t>
+            </w:r>
+          </w:p>
+        </w:tc>
+        <w:tc>
+          <w:tcPr>
+            <w:tcW w:type="dxa" w:w="1800"/>
+            <w:tcBorders>
+              <w:top w:val="single" w:sz="4" w:color="DDDDDD"/>
+              <w:left w:val="single" w:sz="4" w:color="DDDDDD"/>
+              <w:bottom w:val="single" w:sz="4" w:color="DDDDDD"/>
+              <w:right w:val="single" w:sz="4" w:color="DDDDDD"/>
+            </w:tcBorders>
+            <w:shd w:val="clear" w:color="auto" w:fill="FFFFFF"/>
+            <w:tcMar>
+              <w:top w:w="80" w:type="dxa"/>
+              <w:bottom w:w="80" w:type="dxa"/>
+              <w:left w:w="120" w:type="dxa"/>
+              <w:right w:w="120" w:type="dxa"/>
+            </w:tcMar>
+          </w:tcPr>
+          <w:p>
+            <w:r>
+              <w:rPr>
+                <w:rFonts w:ascii="Arial" w:hAnsi="Arial"/>
+                <w:sz w:val="20"/>
+              </w:rPr>
+              <w:t xml:space="preserve">200 VULNERABLE</w:t>
+            </w:r>
+          </w:p>
+        </w:tc>
+        <w:tc>
+          <w:tcPr>
+            <w:tcW w:type="dxa" w:w="1800"/>
+            <w:tcBorders>
+              <w:top w:val="single" w:sz="4" w:color="DDDDDD"/>
+              <w:left w:val="single" w:sz="4" w:color="DDDDDD"/>
+              <w:bottom w:val="single" w:sz="4" w:color="DDDDDD"/>
+              <w:right w:val="single" w:sz="4" w:color="DDDDDD"/>
+            </w:tcBorders>
+            <w:shd w:val="clear" w:color="auto" w:fill="FFFFFF"/>
+            <w:tcMar>
+              <w:top w:w="80" w:type="dxa"/>
+              <w:bottom w:w="80" w:type="dxa"/>
+              <w:left w:w="120" w:type="dxa"/>
+              <w:right w:w="120" w:type="dxa"/>
+            </w:tcMar>
+          </w:tcPr>
+          <w:p>
+            <w:r>
+              <w:rPr>
+                <w:rFonts w:ascii="Arial" w:hAnsi="Arial"/>
+                <w:sz w:val="20"/>
+              </w:rPr>
+              <w:t xml:space="preserve">403 BLOCKED</w:t>
+            </w:r>
+          </w:p>
+        </w:tc>
+        <w:tc>
+          <w:tcPr>
+            <w:tcW w:type="dxa" w:w="3560"/>
+            <w:tcBorders>
+              <w:top w:val="single" w:sz="4" w:color="DDDDDD"/>
+              <w:left w:val="single" w:sz="4" w:color="DDDDDD"/>
+              <w:bottom w:val="single" w:sz="4" w:color="DDDDDD"/>
+              <w:right w:val="single" w:sz="4" w:color="DDDDDD"/>
+            </w:tcBorders>
+            <w:shd w:val="clear" w:color="auto" w:fill="FFFFFF"/>
+            <w:tcMar>
+              <w:top w:w="80" w:type="dxa"/>
+              <w:bottom w:w="80" w:type="dxa"/>
+              <w:left w:w="120" w:type="dxa"/>
+              <w:right w:w="120" w:type="dxa"/>
+            </w:tcMar>
+          </w:tcPr>
+          <w:p>
+            <w:r>
+              <w:rPr>
+                <w:rFonts w:ascii="Arial" w:hAnsi="Arial"/>
+                <w:sz w:val="20"/>
+              </w:rPr>
+              <w:t xml:space="preserve">XSS — libinjection XSS</w:t>
+            </w:r>
+          </w:p>
+        </w:tc>
+      </w:tr>
+      <w:tr>
+        <w:tc>
+          <w:tcPr>
+            <w:tcW w:type="dxa" w:w="2200"/>
+            <w:tcBorders>
+              <w:top w:val="single" w:sz="4" w:color="DDDDDD"/>
+              <w:left w:val="single" w:sz="4" w:color="DDDDDD"/>
+              <w:bottom w:val="single" w:sz="4" w:color="DDDDDD"/>
+              <w:right w:val="single" w:sz="4" w:color="DDDDDD"/>
+            </w:tcBorders>
+            <w:shd w:val="clear" w:color="auto" w:fill="F0F4F8"/>
+            <w:tcMar>
+              <w:top w:w="80" w:type="dxa"/>
+              <w:bottom w:w="80" w:type="dxa"/>
+              <w:left w:w="120" w:type="dxa"/>
+              <w:right w:w="120" w:type="dxa"/>
+            </w:tcMar>
+          </w:tcPr>
+          <w:p>
+            <w:r>
+              <w:rPr>
+                <w:rFonts w:ascii="Arial" w:hAnsi="Arial"/>
+                <w:sz w:val="20"/>
+              </w:rPr>
+              <w:t xml:space="preserve">../../../etc/passwd</w:t>
+            </w:r>
+          </w:p>
+        </w:tc>
+        <w:tc>
+          <w:tcPr>
+            <w:tcW w:type="dxa" w:w="1800"/>
+            <w:tcBorders>
+              <w:top w:val="single" w:sz="4" w:color="DDDDDD"/>
+              <w:left w:val="single" w:sz="4" w:color="DDDDDD"/>
+              <w:bottom w:val="single" w:sz="4" w:color="DDDDDD"/>
+              <w:right w:val="single" w:sz="4" w:color="DDDDDD"/>
+            </w:tcBorders>
+            <w:shd w:val="clear" w:color="auto" w:fill="F0F4F8"/>
+            <w:tcMar>
+              <w:top w:w="80" w:type="dxa"/>
+              <w:bottom w:w="80" w:type="dxa"/>
+              <w:left w:w="120" w:type="dxa"/>
+              <w:right w:w="120" w:type="dxa"/>
+            </w:tcMar>
+          </w:tcPr>
+          <w:p>
+            <w:r>
+              <w:rPr>
+                <w:rFonts w:ascii="Arial" w:hAnsi="Arial"/>
+                <w:sz w:val="20"/>
+              </w:rPr>
+              <w:t xml:space="preserve">200 VULNERABLE</w:t>
+            </w:r>
+          </w:p>
+        </w:tc>
+        <w:tc>
+          <w:tcPr>
+            <w:tcW w:type="dxa" w:w="1800"/>
+            <w:tcBorders>
+              <w:top w:val="single" w:sz="4" w:color="DDDDDD"/>
+              <w:left w:val="single" w:sz="4" w:color="DDDDDD"/>
+              <w:bottom w:val="single" w:sz="4" w:color="DDDDDD"/>
+              <w:right w:val="single" w:sz="4" w:color="DDDDDD"/>
+            </w:tcBorders>
+            <w:shd w:val="clear" w:color="auto" w:fill="F0F4F8"/>
+            <w:tcMar>
+              <w:top w:w="80" w:type="dxa"/>
+              <w:bottom w:w="80" w:type="dxa"/>
+              <w:left w:w="120" w:type="dxa"/>
+              <w:right w:w="120" w:type="dxa"/>
+            </w:tcMar>
+          </w:tcPr>
+          <w:p>
+            <w:r>
+              <w:rPr>
+                <w:rFonts w:ascii="Arial" w:hAnsi="Arial"/>
+                <w:sz w:val="20"/>
+              </w:rPr>
+              <w:t xml:space="preserve">403 BLOCKED</w:t>
+            </w:r>
+          </w:p>
+        </w:tc>
+        <w:tc>
+          <w:tcPr>
+            <w:tcW w:type="dxa" w:w="3560"/>
+            <w:tcBorders>
+              <w:top w:val="single" w:sz="4" w:color="DDDDDD"/>
+              <w:left w:val="single" w:sz="4" w:color="DDDDDD"/>
+              <w:bottom w:val="single" w:sz="4" w:color="DDDDDD"/>
+              <w:right w:val="single" w:sz="4" w:color="DDDDDD"/>
+            </w:tcBorders>
+            <w:shd w:val="clear" w:color="auto" w:fill="F0F4F8"/>
+            <w:tcMar>
+              <w:top w:w="80" w:type="dxa"/>
+              <w:bottom w:w="80" w:type="dxa"/>
+              <w:left w:w="120" w:type="dxa"/>
+              <w:right w:w="120" w:type="dxa"/>
+            </w:tcMar>
+          </w:tcPr>
+          <w:p>
+            <w:r>
+              <w:rPr>
+                <w:rFonts w:ascii="Arial" w:hAnsi="Arial"/>
+                <w:sz w:val="20"/>
+              </w:rPr>
+              <w:t xml:space="preserve">LFI — path traversal</w:t>
+            </w:r>
+          </w:p>
+        </w:tc>
+      </w:tr>
+      <w:tr>
+        <w:tc>
+          <w:tcPr>
+            <w:tcW w:type="dxa" w:w="2200"/>
+            <w:tcBorders>
+              <w:top w:val="single" w:sz="4" w:color="DDDDDD"/>
+              <w:left w:val="single" w:sz="4" w:color="DDDDDD"/>
+              <w:bottom w:val="single" w:sz="4" w:color="DDDDDD"/>
+              <w:right w:val="single" w:sz="4" w:color="DDDDDD"/>
+            </w:tcBorders>
+            <w:shd w:val="clear" w:color="auto" w:fill="FFFFFF"/>
+            <w:tcMar>
+              <w:top w:w="80" w:type="dxa"/>
+              <w:bottom w:w="80" w:type="dxa"/>
+              <w:left w:w="120" w:type="dxa"/>
+              <w:right w:w="120" w:type="dxa"/>
+            </w:tcMar>
+          </w:tcPr>
+          <w:p>
+            <w:r>
+              <w:rPr>
+                <w:rFonts w:ascii="Arial" w:hAnsi="Arial"/>
+                <w:sz w:val="20"/>
+              </w:rPr>
+              <w:t xml:space="preserve">apple (clean search)</w:t>
+            </w:r>
+          </w:p>
+        </w:tc>
+        <w:tc>
+          <w:tcPr>
+            <w:tcW w:type="dxa" w:w="1800"/>
+            <w:tcBorders>
+              <w:top w:val="single" w:sz="4" w:color="DDDDDD"/>
+              <w:left w:val="single" w:sz="4" w:color="DDDDDD"/>
+              <w:bottom w:val="single" w:sz="4" w:color="DDDDDD"/>
+              <w:right w:val="single" w:sz="4" w:color="DDDDDD"/>
+            </w:tcBorders>
+            <w:shd w:val="clear" w:color="auto" w:fill="FFFFFF"/>
+            <w:tcMar>
+              <w:top w:w="80" w:type="dxa"/>
+              <w:bottom w:w="80" w:type="dxa"/>
+              <w:left w:w="120" w:type="dxa"/>
+              <w:right w:w="120" w:type="dxa"/>
+            </w:tcMar>
+          </w:tcPr>
+          <w:p>
+            <w:r>
+              <w:rPr>
+                <w:rFonts w:ascii="Arial" w:hAnsi="Arial"/>
+                <w:sz w:val="20"/>
+              </w:rPr>
+              <w:t xml:space="preserve">200 OK</w:t>
+            </w:r>
+          </w:p>
+        </w:tc>
+        <w:tc>
+          <w:tcPr>
+            <w:tcW w:type="dxa" w:w="1800"/>
+            <w:tcBorders>
+              <w:top w:val="single" w:sz="4" w:color="DDDDDD"/>
+              <w:left w:val="single" w:sz="4" w:color="DDDDDD"/>
+              <w:bottom w:val="single" w:sz="4" w:color="DDDDDD"/>
+              <w:right w:val="single" w:sz="4" w:color="DDDDDD"/>
+            </w:tcBorders>
+            <w:shd w:val="clear" w:color="auto" w:fill="FFFFFF"/>
+            <w:tcMar>
+              <w:top w:w="80" w:type="dxa"/>
+              <w:bottom w:w="80" w:type="dxa"/>
+              <w:left w:w="120" w:type="dxa"/>
+              <w:right w:w="120" w:type="dxa"/>
+            </w:tcMar>
+          </w:tcPr>
+          <w:p>
+            <w:r>
+              <w:rPr>
+                <w:rFonts w:ascii="Arial" w:hAnsi="Arial"/>
+                <w:sz w:val="20"/>
+              </w:rPr>
+              <w:t xml:space="preserve">200 OK</w:t>
+            </w:r>
+          </w:p>
+        </w:tc>
+        <w:tc>
+          <w:tcPr>
+            <w:tcW w:type="dxa" w:w="3560"/>
+            <w:tcBorders>
+              <w:top w:val="single" w:sz="4" w:color="DDDDDD"/>
+              <w:left w:val="single" w:sz="4" w:color="DDDDDD"/>
+              <w:bottom w:val="single" w:sz="4" w:color="DDDDDD"/>
+              <w:right w:val="single" w:sz="4" w:color="DDDDDD"/>
+            </w:tcBorders>
+            <w:shd w:val="clear" w:color="auto" w:fill="FFFFFF"/>
+            <w:tcMar>
+              <w:top w:w="80" w:type="dxa"/>
+              <w:bottom w:w="80" w:type="dxa"/>
+              <w:left w:w="120" w:type="dxa"/>
+              <w:right w:w="120" w:type="dxa"/>
+            </w:tcMar>
+          </w:tcPr>
+          <w:p>
+            <w:r>
+              <w:rPr>
+                <w:rFonts w:ascii="Arial" w:hAnsi="Arial"/>
+                <w:sz w:val="20"/>
+              </w:rPr>
+              <w:t xml:space="preserve">No pattern matched</w:t>
+            </w:r>
+          </w:p>
+        </w:tc>
+      </w:tr>
+    </w:tbl>
+    <w:p>
+      <w:r>
+        <w:t xml:space="preserve"/>
+      </w:r>
+    </w:p>
+    <w:p>
+      <w:r>
+        <w:rPr>
+          <w:rFonts w:ascii="Arial" w:hAnsi="Arial"/>
+          <w:b/>
+          <w:sz w:val="22"/>
+        </w:rPr>
+        <w:t xml:space="preserve">Three fixes were required to reach confirmed blocking:</w:t>
+      </w:r>
+    </w:p>
+    <w:p>
+      <w:r>
+        <w:rPr>
+          <w:rFonts w:ascii="Arial" w:hAnsi="Arial"/>
+          <w:sz w:val="22"/>
+        </w:rPr>
+        <w:t xml:space="preserve">1. Pin dd-trace@4 — v5 moved WAF rules to remote config, requiring a connected Datadog agent. Without an agent, v5 has no rules and cannot block.</w:t>
+      </w:r>
+    </w:p>
+    <w:p>
+      <w:r>
+        <w:rPr>
+          <w:rFonts w:ascii="Arial" w:hAnsi="Arial"/>
+          <w:sz w:val="22"/>
+        </w:rPr>
+        <w:t xml:space="preserve">2. Install detect-libc@1 — node-gyp-build calls detect-libc.familySync() to construct the libddwaf binary path as linuxglibc-arm64. Without detect-libc installed, it falls back to linux-arm64, which does not exist, and the WAF engine never loads.</w:t>
+      </w:r>
+    </w:p>
+    <w:p>
+      <w:r>
+        <w:rPr>
+          <w:rFonts w:ascii="Arial" w:hAnsi="Arial"/>
+          <w:sz w:val="22"/>
+        </w:rPr>
+        <w:t xml:space="preserve">3. Create dd-blocking-rules.json — dd-trace v4 ships recommended.json in monitoring mode (on_match:[]). A custom rules file with on_match:[block] is required. Set DD_APPSEC_RULES env var to point to it.</w:t>
+      </w:r>
+    </w:p>
+    <w:p>
+      <w:r>
+        <w:t xml:space="preserve"/>
+      </w:r>
+    </w:p>
+    <w:p>
+      <w:r>
+        <w:rPr>
+          <w:rFonts w:ascii="Arial" w:hAnsi="Arial"/>
+          <w:sz w:val="22"/>
+        </w:rPr>
+        <w:t xml:space="preserve">Optional — connect Datadog dashboard:</w:t>
+      </w:r>
+    </w:p>
+    <w:p>
+      <w:pPr>
+        <w:pBdr>
+          <w:top w:val="single" w:color="CCCCCC" w:sz="4" w:space="1"/>
+          <w:left w:val="single" w:color="CCCCCC" w:sz="4" w:space="4"/>
+          <w:bottom w:val="single" w:color="CCCCCC" w:sz="4" w:space="1"/>
+          <w:right w:val="single" w:color="CCCCCC" w:sz="4" w:space="4"/>
+        </w:pBdr>
+        <w:shd w:fill="F5F5F5" w:val="clear"/>
+        <w:spacing w:after="160"/>
+      </w:pPr>
+      <w:r>
+        <w:rPr>
+          <w:rFonts w:ascii="Courier New" w:hAnsi="Courier New"/>
+          <w:sz w:val="18"/>
+        </w:rPr>
+        <w:t xml:space="preserve">echo "DD_API_KEY=your_key_here" &gt;&gt; .env</w:t>
+      </w:r>
+      <w:r>
+        <w:rPr>
+          <w:rFonts w:ascii="Courier New" w:hAnsi="Courier New"/>
+          <w:sz w:val="18"/>
+        </w:rPr>
+        <w:br/>
+      </w:r>
+      <w:r>
+        <w:rPr>
+          <w:rFonts w:ascii="Courier New" w:hAnsi="Courier New"/>
+          <w:sz w:val="18"/>
+        </w:rPr>
+        <w:t xml:space="preserve">docker compose --profile datadog-asm up -d</w:t>
+      </w:r>
+      <w:r>
+        <w:rPr>
+          <w:rFonts w:ascii="Courier New" w:hAnsi="Courier New"/>
+          <w:sz w:val="18"/>
+        </w:rPr>
+        <w:br/>
+      </w:r>
+      <w:r>
+        <w:rPr>
+          <w:rFonts w:ascii="Courier New" w:hAnsi="Courier New"/>
+          <w:sz w:val="18"/>
+        </w:rPr>
+        <w:t xml:space="preserve"># View attacks: https://app.datadoghq.com/security/appsec</w:t>
+      </w:r>
+    </w:p>
+    <w:p>
+      <w:r>
+        <w:t xml:space="preserve"/>
+      </w:r>
+    </w:p>
+    <w:p>
+      <w:pPr>
+        <w:pStyle w:val="Heading2"/>
+      </w:pPr>
+      <w:r>
+        <w:rPr>
+          <w:color w:val="1F3864"/>
+        </w:rPr>
+        <w:t xml:space="preserve">Exercise 4.6.6 — Signal Sciences (Architecture Study)</w:t>
+      </w:r>
+    </w:p>
+    <w:p>
+      <w:pPr>
+        <w:pBdr>
+          <w:top w:val="single" w:color="1F3864" w:sz="4" w:space="1"/>
+          <w:left w:val="single" w:color="1F3864" w:sz="8" w:space="4"/>
+          <w:bottom w:val="single" w:color="1F3864" w:sz="4" w:space="1"/>
+          <w:right w:val="single" w:color="1F3864" w:sz="4" w:space="4"/>
+        </w:pBdr>
+        <w:shd w:fill="EBF3F9" w:val="clear"/>
+      </w:pPr>
+      <w:r>
+        <w:rPr>
+          <w:rFonts w:ascii="Arial" w:hAnsi="Arial"/>
+          <w:b/>
+          <w:sz w:val="20"/>
+          <w:color w:val="1F3864"/>
+        </w:rPr>
+        <w:t xml:space="preserve">Enterprise license required — no free tier. Read sigsci-middleware-example.js for the architecture.</w:t>
+      </w:r>
+    </w:p>
+    <w:p>
+      <w:r>
+        <w:rPr>
+          <w:rFonts w:ascii="Arial" w:hAnsi="Arial"/>
+          <w:sz w:val="22"/>
+        </w:rPr>
+        <w:t xml:space="preserve">Signal Sciences uses a sidecar model: the Node.js Express middleware sends request metadata to a local sigsci-agent daemon on port 9999, which makes the allow/block decision in ~0.1–1 ms and streams telemetry to the Signal Sciences cloud platform.</w:t>
+      </w:r>
+    </w:p>
+    <w:p>
+      <w:r>
+        <w:t xml:space="preserve"/>
+      </w:r>
+    </w:p>
+    <w:p>
+      <w:r>
+        <w:rPr>
+          <w:rFonts w:ascii="Arial" w:hAnsi="Arial"/>
+          <w:sz w:val="22"/>
+        </w:rPr>
+        <w:t xml:space="preserve">Sidecar model differs from in-process RASP in three key ways:</w:t>
+      </w:r>
+    </w:p>
+    <w:p>
+      <w:r>
+        <w:rPr>
+          <w:rFonts w:ascii="Arial" w:hAnsi="Arial"/>
+          <w:sz w:val="22"/>
+        </w:rPr>
+        <w:t xml:space="preserve">1. Crash isolation — if the agent daemon crashes, the application process continues running (fail-open by default).</w:t>
+      </w:r>
+    </w:p>
+    <w:p>
+      <w:r>
+        <w:rPr>
+          <w:rFonts w:ascii="Arial" w:hAnsi="Arial"/>
+          <w:sz w:val="22"/>
+        </w:rPr>
+        <w:t xml:space="preserve">2. Language-agnostic — the same sigsci-agent binary handles any language that can make an HTTP call to port 9999.</w:t>
+      </w:r>
+    </w:p>
+    <w:p>
+      <w:r>
+        <w:rPr>
+          <w:rFonts w:ascii="Arial" w:hAnsi="Arial"/>
+          <w:sz w:val="22"/>
+        </w:rPr>
+        <w:t xml:space="preserve">3. Centralised rule management — rules update from the cloud without requiring an application redeploy.</w:t>
+      </w:r>
+    </w:p>
+    <w:p>
+      <w:r>
+        <w:t xml:space="preserve"/>
+      </w:r>
+    </w:p>
+    <w:p>
+      <w:pPr>
         <w:pStyle w:val="Heading2"/>
       </w:pPr>
       <w:r>
@@ -11431,6 +13872,446 @@
                 <w:sz w:val="20"/>
               </w:rPr>
               <w:t>-o /dev/null discards body; -w prints HTTP status. 403 = RASP threw error before query ran. 200 = no pattern matched (clean). 000 = container not running.</w:t>
+            </w:r>
+          </w:p>
+        </w:tc>
+      </w:tr>
+      <w:tr>
+        <w:tc>
+          <w:tcPr>
+            <w:tcW w:type="dxa" w:w="700"/>
+            <w:tcBorders>
+              <w:top w:val="single" w:sz="4" w:color="DDDDDD"/>
+              <w:left w:val="single" w:sz="4" w:color="DDDDDD"/>
+              <w:bottom w:val="single" w:sz="4" w:color="DDDDDD"/>
+              <w:right w:val="single" w:sz="4" w:color="DDDDDD"/>
+            </w:tcBorders>
+            <w:shd w:val="clear" w:color="auto" w:fill="F0F4F8"/>
+            <w:tcMar>
+              <w:top w:w="80" w:type="dxa"/>
+              <w:bottom w:w="80" w:type="dxa"/>
+              <w:left w:w="120" w:type="dxa"/>
+              <w:right w:w="120" w:type="dxa"/>
+            </w:tcMar>
+          </w:tcPr>
+          <w:p>
+            <w:r>
+              <w:rPr>
+                <w:rFonts w:ascii="Arial" w:hAnsi="Arial"/>
+                <w:sz w:val="20"/>
+              </w:rPr>
+              <w:t xml:space="preserve">M4.6</w:t>
+            </w:r>
+          </w:p>
+        </w:tc>
+        <w:tc>
+          <w:tcPr>
+            <w:tcW w:type="dxa" w:w="2600"/>
+            <w:tcBorders>
+              <w:top w:val="single" w:sz="4" w:color="DDDDDD"/>
+              <w:left w:val="single" w:sz="4" w:color="DDDDDD"/>
+              <w:bottom w:val="single" w:sz="4" w:color="DDDDDD"/>
+              <w:right w:val="single" w:sz="4" w:color="DDDDDD"/>
+            </w:tcBorders>
+            <w:shd w:val="clear" w:color="auto" w:fill="F0F4F8"/>
+            <w:tcMar>
+              <w:top w:w="80" w:type="dxa"/>
+              <w:bottom w:w="80" w:type="dxa"/>
+              <w:left w:w="120" w:type="dxa"/>
+              <w:right w:w="120" w:type="dxa"/>
+            </w:tcMar>
+          </w:tcPr>
+          <w:p>
+            <w:r>
+              <w:rPr>
+                <w:rFonts w:ascii="Arial" w:hAnsi="Arial"/>
+                <w:sz w:val="20"/>
+              </w:rPr>
+              <w:t xml:space="preserve">docker compose --profile appsensor build</w:t>
+            </w:r>
+          </w:p>
+        </w:tc>
+        <w:tc>
+          <w:tcPr>
+            <w:tcW w:type="dxa" w:w="2600"/>
+            <w:tcBorders>
+              <w:top w:val="single" w:sz="4" w:color="DDDDDD"/>
+              <w:left w:val="single" w:sz="4" w:color="DDDDDD"/>
+              <w:bottom w:val="single" w:sz="4" w:color="DDDDDD"/>
+              <w:right w:val="single" w:sz="4" w:color="DDDDDD"/>
+            </w:tcBorders>
+            <w:shd w:val="clear" w:color="auto" w:fill="F0F4F8"/>
+            <w:tcMar>
+              <w:top w:w="80" w:type="dxa"/>
+              <w:bottom w:w="80" w:type="dxa"/>
+              <w:left w:w="120" w:type="dxa"/>
+              <w:right w:w="120" w:type="dxa"/>
+            </w:tcMar>
+          </w:tcPr>
+          <w:p>
+            <w:r>
+              <w:rPr>
+                <w:rFonts w:ascii="Arial" w:hAnsi="Arial"/>
+                <w:sz w:val="20"/>
+              </w:rPr>
+              <w:t xml:space="preserve">Build AppSensor-instrumented Juice Shop</w:t>
+            </w:r>
+          </w:p>
+        </w:tc>
+        <w:tc>
+          <w:tcPr>
+            <w:tcW w:type="dxa" w:w="3460"/>
+            <w:tcBorders>
+              <w:top w:val="single" w:sz="4" w:color="DDDDDD"/>
+              <w:left w:val="single" w:sz="4" w:color="DDDDDD"/>
+              <w:bottom w:val="single" w:sz="4" w:color="DDDDDD"/>
+              <w:right w:val="single" w:sz="4" w:color="DDDDDD"/>
+            </w:tcBorders>
+            <w:shd w:val="clear" w:color="auto" w:fill="F0F4F8"/>
+            <w:tcMar>
+              <w:top w:w="80" w:type="dxa"/>
+              <w:bottom w:w="80" w:type="dxa"/>
+              <w:left w:w="120" w:type="dxa"/>
+              <w:right w:w="120" w:type="dxa"/>
+            </w:tcMar>
+          </w:tcPr>
+          <w:p>
+            <w:r>
+              <w:rPr>
+                <w:rFonts w:ascii="Arial" w:hAnsi="Arial"/>
+                <w:sz w:val="20"/>
+              </w:rPr>
+              <w:t xml:space="preserve">Injects appsensor-hook.js via NODE_OPTIONS --require. Hook patches http.Server to inspect every incoming request and tracks IP-keyed counters using AsyncLocalStorage.</w:t>
+            </w:r>
+          </w:p>
+        </w:tc>
+      </w:tr>
+      <w:tr>
+        <w:tc>
+          <w:tcPr>
+            <w:tcW w:type="dxa" w:w="700"/>
+            <w:tcBorders>
+              <w:top w:val="single" w:sz="4" w:color="DDDDDD"/>
+              <w:left w:val="single" w:sz="4" w:color="DDDDDD"/>
+              <w:bottom w:val="single" w:sz="4" w:color="DDDDDD"/>
+              <w:right w:val="single" w:sz="4" w:color="DDDDDD"/>
+            </w:tcBorders>
+            <w:shd w:val="clear" w:color="auto" w:fill="FFFFFF"/>
+            <w:tcMar>
+              <w:top w:w="80" w:type="dxa"/>
+              <w:bottom w:w="80" w:type="dxa"/>
+              <w:left w:w="120" w:type="dxa"/>
+              <w:right w:w="120" w:type="dxa"/>
+            </w:tcMar>
+          </w:tcPr>
+          <w:p>
+            <w:r>
+              <w:rPr>
+                <w:rFonts w:ascii="Arial" w:hAnsi="Arial"/>
+                <w:sz w:val="20"/>
+              </w:rPr>
+              <w:t xml:space="preserve">M4.6</w:t>
+            </w:r>
+          </w:p>
+        </w:tc>
+        <w:tc>
+          <w:tcPr>
+            <w:tcW w:type="dxa" w:w="2600"/>
+            <w:tcBorders>
+              <w:top w:val="single" w:sz="4" w:color="DDDDDD"/>
+              <w:left w:val="single" w:sz="4" w:color="DDDDDD"/>
+              <w:bottom w:val="single" w:sz="4" w:color="DDDDDD"/>
+              <w:right w:val="single" w:sz="4" w:color="DDDDDD"/>
+            </w:tcBorders>
+            <w:shd w:val="clear" w:color="auto" w:fill="FFFFFF"/>
+            <w:tcMar>
+              <w:top w:w="80" w:type="dxa"/>
+              <w:bottom w:w="80" w:type="dxa"/>
+              <w:left w:w="120" w:type="dxa"/>
+              <w:right w:w="120" w:type="dxa"/>
+            </w:tcMar>
+          </w:tcPr>
+          <w:p>
+            <w:r>
+              <w:rPr>
+                <w:rFonts w:ascii="Arial" w:hAnsi="Arial"/>
+                <w:sz w:val="20"/>
+              </w:rPr>
+              <w:t xml:space="preserve">for i in {1..6}; do curl .../search?q=SQLi; done</w:t>
+            </w:r>
+          </w:p>
+        </w:tc>
+        <w:tc>
+          <w:tcPr>
+            <w:tcW w:type="dxa" w:w="2600"/>
+            <w:tcBorders>
+              <w:top w:val="single" w:sz="4" w:color="DDDDDD"/>
+              <w:left w:val="single" w:sz="4" w:color="DDDDDD"/>
+              <w:bottom w:val="single" w:sz="4" w:color="DDDDDD"/>
+              <w:right w:val="single" w:sz="4" w:color="DDDDDD"/>
+            </w:tcBorders>
+            <w:shd w:val="clear" w:color="auto" w:fill="FFFFFF"/>
+            <w:tcMar>
+              <w:top w:w="80" w:type="dxa"/>
+              <w:bottom w:w="80" w:type="dxa"/>
+              <w:left w:w="120" w:type="dxa"/>
+              <w:right w:w="120" w:type="dxa"/>
+            </w:tcMar>
+          </w:tcPr>
+          <w:p>
+            <w:r>
+              <w:rPr>
+                <w:rFonts w:ascii="Arial" w:hAnsi="Arial"/>
+                <w:sz w:val="20"/>
+              </w:rPr>
+              <w:t xml:space="preserve">Send 6 sequential SQLi requests to trigger full escalation</w:t>
+            </w:r>
+          </w:p>
+        </w:tc>
+        <w:tc>
+          <w:tcPr>
+            <w:tcW w:type="dxa" w:w="3460"/>
+            <w:tcBorders>
+              <w:top w:val="single" w:sz="4" w:color="DDDDDD"/>
+              <w:left w:val="single" w:sz="4" w:color="DDDDDD"/>
+              <w:bottom w:val="single" w:sz="4" w:color="DDDDDD"/>
+              <w:right w:val="single" w:sz="4" w:color="DDDDDD"/>
+            </w:tcBorders>
+            <w:shd w:val="clear" w:color="auto" w:fill="FFFFFF"/>
+            <w:tcMar>
+              <w:top w:w="80" w:type="dxa"/>
+              <w:bottom w:w="80" w:type="dxa"/>
+              <w:left w:w="120" w:type="dxa"/>
+              <w:right w:w="120" w:type="dxa"/>
+            </w:tcMar>
+          </w:tcPr>
+          <w:p>
+            <w:r>
+              <w:rPr>
+                <w:rFonts w:ascii="Arial" w:hAnsi="Arial"/>
+                <w:sz w:val="20"/>
+              </w:rPr>
+              <w:t xml:space="preserve">Each curl hit increments the IE2 counter for the source IP. Counter 1-2 = LOG (pass). Counter 3-4 = WARN (429). Counter 5+ = BLOCK (403). Juice Shop runs multi-query searches so counter increments faster than 1:1.</w:t>
+            </w:r>
+          </w:p>
+        </w:tc>
+      </w:tr>
+      <w:tr>
+        <w:tc>
+          <w:tcPr>
+            <w:tcW w:type="dxa" w:w="700"/>
+            <w:tcBorders>
+              <w:top w:val="single" w:sz="4" w:color="DDDDDD"/>
+              <w:left w:val="single" w:sz="4" w:color="DDDDDD"/>
+              <w:bottom w:val="single" w:sz="4" w:color="DDDDDD"/>
+              <w:right w:val="single" w:sz="4" w:color="DDDDDD"/>
+            </w:tcBorders>
+            <w:shd w:val="clear" w:color="auto" w:fill="F0F4F8"/>
+            <w:tcMar>
+              <w:top w:w="80" w:type="dxa"/>
+              <w:bottom w:w="80" w:type="dxa"/>
+              <w:left w:w="120" w:type="dxa"/>
+              <w:right w:w="120" w:type="dxa"/>
+            </w:tcMar>
+          </w:tcPr>
+          <w:p>
+            <w:r>
+              <w:rPr>
+                <w:rFonts w:ascii="Arial" w:hAnsi="Arial"/>
+                <w:sz w:val="20"/>
+              </w:rPr>
+              <w:t xml:space="preserve">M4.6</w:t>
+            </w:r>
+          </w:p>
+        </w:tc>
+        <w:tc>
+          <w:tcPr>
+            <w:tcW w:type="dxa" w:w="2600"/>
+            <w:tcBorders>
+              <w:top w:val="single" w:sz="4" w:color="DDDDDD"/>
+              <w:left w:val="single" w:sz="4" w:color="DDDDDD"/>
+              <w:bottom w:val="single" w:sz="4" w:color="DDDDDD"/>
+              <w:right w:val="single" w:sz="4" w:color="DDDDDD"/>
+            </w:tcBorders>
+            <w:shd w:val="clear" w:color="auto" w:fill="F0F4F8"/>
+            <w:tcMar>
+              <w:top w:w="80" w:type="dxa"/>
+              <w:bottom w:w="80" w:type="dxa"/>
+              <w:left w:w="120" w:type="dxa"/>
+              <w:right w:w="120" w:type="dxa"/>
+            </w:tcMar>
+          </w:tcPr>
+          <w:p>
+            <w:r>
+              <w:rPr>
+                <w:rFonts w:ascii="Arial" w:hAnsi="Arial"/>
+                <w:sz w:val="20"/>
+              </w:rPr>
+              <w:t xml:space="preserve">docker compose --profile datadog-asm build</w:t>
+            </w:r>
+          </w:p>
+        </w:tc>
+        <w:tc>
+          <w:tcPr>
+            <w:tcW w:type="dxa" w:w="2600"/>
+            <w:tcBorders>
+              <w:top w:val="single" w:sz="4" w:color="DDDDDD"/>
+              <w:left w:val="single" w:sz="4" w:color="DDDDDD"/>
+              <w:bottom w:val="single" w:sz="4" w:color="DDDDDD"/>
+              <w:right w:val="single" w:sz="4" w:color="DDDDDD"/>
+            </w:tcBorders>
+            <w:shd w:val="clear" w:color="auto" w:fill="F0F4F8"/>
+            <w:tcMar>
+              <w:top w:w="80" w:type="dxa"/>
+              <w:bottom w:w="80" w:type="dxa"/>
+              <w:left w:w="120" w:type="dxa"/>
+              <w:right w:w="120" w:type="dxa"/>
+            </w:tcMar>
+          </w:tcPr>
+          <w:p>
+            <w:r>
+              <w:rPr>
+                <w:rFonts w:ascii="Arial" w:hAnsi="Arial"/>
+                <w:sz w:val="20"/>
+              </w:rPr>
+              <w:t xml:space="preserve">Build Datadog ASM-instrumented Juice Shop</w:t>
+            </w:r>
+          </w:p>
+        </w:tc>
+        <w:tc>
+          <w:tcPr>
+            <w:tcW w:type="dxa" w:w="3460"/>
+            <w:tcBorders>
+              <w:top w:val="single" w:sz="4" w:color="DDDDDD"/>
+              <w:left w:val="single" w:sz="4" w:color="DDDDDD"/>
+              <w:bottom w:val="single" w:sz="4" w:color="DDDDDD"/>
+              <w:right w:val="single" w:sz="4" w:color="DDDDDD"/>
+            </w:tcBorders>
+            <w:shd w:val="clear" w:color="auto" w:fill="F0F4F8"/>
+            <w:tcMar>
+              <w:top w:w="80" w:type="dxa"/>
+              <w:bottom w:w="80" w:type="dxa"/>
+              <w:left w:w="120" w:type="dxa"/>
+              <w:right w:w="120" w:type="dxa"/>
+            </w:tcMar>
+          </w:tcPr>
+          <w:p>
+            <w:r>
+              <w:rPr>
+                <w:rFonts w:ascii="Arial" w:hAnsi="Arial"/>
+                <w:sz w:val="20"/>
+              </w:rPr>
+              <w:t xml:space="preserve">Multi-stage: node:24-slim builder installs dd-trace@4 + detect-libc@1. Final stage copies dd_modules/ and dd-blocking-rules.json into distroless image. NODE_OPTIONS --require loads datadog-rasp-wrapper.js before app starts.</w:t>
+            </w:r>
+          </w:p>
+        </w:tc>
+      </w:tr>
+      <w:tr>
+        <w:tc>
+          <w:tcPr>
+            <w:tcW w:type="dxa" w:w="700"/>
+            <w:tcBorders>
+              <w:top w:val="single" w:sz="4" w:color="DDDDDD"/>
+              <w:left w:val="single" w:sz="4" w:color="DDDDDD"/>
+              <w:bottom w:val="single" w:sz="4" w:color="DDDDDD"/>
+              <w:right w:val="single" w:sz="4" w:color="DDDDDD"/>
+            </w:tcBorders>
+            <w:shd w:val="clear" w:color="auto" w:fill="FFFFFF"/>
+            <w:tcMar>
+              <w:top w:w="80" w:type="dxa"/>
+              <w:bottom w:w="80" w:type="dxa"/>
+              <w:left w:w="120" w:type="dxa"/>
+              <w:right w:w="120" w:type="dxa"/>
+            </w:tcMar>
+          </w:tcPr>
+          <w:p>
+            <w:r>
+              <w:rPr>
+                <w:rFonts w:ascii="Arial" w:hAnsi="Arial"/>
+                <w:sz w:val="20"/>
+              </w:rPr>
+              <w:t xml:space="preserve">M4.6</w:t>
+            </w:r>
+          </w:p>
+        </w:tc>
+        <w:tc>
+          <w:tcPr>
+            <w:tcW w:type="dxa" w:w="2600"/>
+            <w:tcBorders>
+              <w:top w:val="single" w:sz="4" w:color="DDDDDD"/>
+              <w:left w:val="single" w:sz="4" w:color="DDDDDD"/>
+              <w:bottom w:val="single" w:sz="4" w:color="DDDDDD"/>
+              <w:right w:val="single" w:sz="4" w:color="DDDDDD"/>
+            </w:tcBorders>
+            <w:shd w:val="clear" w:color="auto" w:fill="FFFFFF"/>
+            <w:tcMar>
+              <w:top w:w="80" w:type="dxa"/>
+              <w:bottom w:w="80" w:type="dxa"/>
+              <w:left w:w="120" w:type="dxa"/>
+              <w:right w:w="120" w:type="dxa"/>
+            </w:tcMar>
+          </w:tcPr>
+          <w:p>
+            <w:r>
+              <w:rPr>
+                <w:rFonts w:ascii="Arial" w:hAnsi="Arial"/>
+                <w:sz w:val="20"/>
+              </w:rPr>
+              <w:t xml:space="preserve">curl -w "%{http_code}" .../search?q=%27+OR+1%3D1--</w:t>
+            </w:r>
+          </w:p>
+        </w:tc>
+        <w:tc>
+          <w:tcPr>
+            <w:tcW w:type="dxa" w:w="2600"/>
+            <w:tcBorders>
+              <w:top w:val="single" w:sz="4" w:color="DDDDDD"/>
+              <w:left w:val="single" w:sz="4" w:color="DDDDDD"/>
+              <w:bottom w:val="single" w:sz="4" w:color="DDDDDD"/>
+              <w:right w:val="single" w:sz="4" w:color="DDDDDD"/>
+            </w:tcBorders>
+            <w:shd w:val="clear" w:color="auto" w:fill="FFFFFF"/>
+            <w:tcMar>
+              <w:top w:w="80" w:type="dxa"/>
+              <w:bottom w:w="80" w:type="dxa"/>
+              <w:left w:w="120" w:type="dxa"/>
+              <w:right w:w="120" w:type="dxa"/>
+            </w:tcMar>
+          </w:tcPr>
+          <w:p>
+            <w:r>
+              <w:rPr>
+                <w:rFonts w:ascii="Arial" w:hAnsi="Arial"/>
+                <w:sz w:val="20"/>
+              </w:rPr>
+              <w:t xml:space="preserve">Test SQLi blocking against Datadog ASM</w:t>
+            </w:r>
+          </w:p>
+        </w:tc>
+        <w:tc>
+          <w:tcPr>
+            <w:tcW w:type="dxa" w:w="3460"/>
+            <w:tcBorders>
+              <w:top w:val="single" w:sz="4" w:color="DDDDDD"/>
+              <w:left w:val="single" w:sz="4" w:color="DDDDDD"/>
+              <w:bottom w:val="single" w:sz="4" w:color="DDDDDD"/>
+              <w:right w:val="single" w:sz="4" w:color="DDDDDD"/>
+            </w:tcBorders>
+            <w:shd w:val="clear" w:color="auto" w:fill="FFFFFF"/>
+            <w:tcMar>
+              <w:top w:w="80" w:type="dxa"/>
+              <w:bottom w:w="80" w:type="dxa"/>
+              <w:left w:w="120" w:type="dxa"/>
+              <w:right w:w="120" w:type="dxa"/>
+            </w:tcMar>
+          </w:tcPr>
+          <w:p>
+            <w:r>
+              <w:rPr>
+                <w:rFonts w:ascii="Arial" w:hAnsi="Arial"/>
+                <w:sz w:val="20"/>
+              </w:rPr>
+              <w:t xml:space="preserve">-w prints HTTP status only. 403 = libddwaf matched the custom blocking rule and blocked before app code ran. 200 = no rule matched (clean input). 500 = rule matched but on_match is empty (monitoring mode — fix: use dd-blocking-rules.json).</w:t>
             </w:r>
           </w:p>
         </w:tc>

</xml_diff>

<commit_message>
module-3.5: Phase 2 tool revisit — jwt_tool alg:none confirmed, kiterunner 0-hit analysis, docs updated
</commit_message>
<xml_diff>
--- a/devsecops-lab/docs/Lab-Walkthrough-Modules-1-to-4.6.docx
+++ b/devsecops-lab/docs/Lab-Walkthrough-Modules-1-to-4.6.docx
@@ -1974,6 +1974,378 @@
     </w:p>
     <w:p>
       <w:pPr>
+        <w:pStyle w:val="Heading2"/>
+        <w:spacing w:before="240" w:after="60"/>
+      </w:pPr>
+      <w:r>
+        <w:rPr>
+          <w:color w:val="1F497D"/>
+        </w:rPr>
+        <w:t>3.5 Phase 2 — Tool Revisit (2026-03-17)</w:t>
+      </w:r>
+    </w:p>
+    <w:p>
+      <w:pPr>
+        <w:spacing w:after="80"/>
+      </w:pPr>
+      <w:r>
+        <w:t>Phase 2 revisits the exercises marked as planned in Phase 1, running automated tooling against crAPI and standing up vAPI as a second target.</w:t>
+      </w:r>
+    </w:p>
+    <w:p>
+      <w:pPr>
+        <w:pStyle w:val="Heading3"/>
+        <w:spacing w:before="160" w:after="60"/>
+      </w:pPr>
+      <w:r>
+        <w:t>3.5.7  jwt_tool — Token Analysis and alg:none Attack</w:t>
+      </w:r>
+    </w:p>
+    <w:p>
+      <w:pPr>
+        <w:spacing w:after="60"/>
+      </w:pPr>
+      <w:r>
+        <w:t>Install jwt_tool from source (not on PyPI):</w:t>
+      </w:r>
+    </w:p>
+    <w:p>
+      <w:pPr>
+        <w:pStyle w:val="Normal"/>
+        <w:spacing w:after="20"/>
+        <w:ind w:left="432"/>
+      </w:pPr>
+      <w:r>
+        <w:rPr>
+          <w:rFonts w:ascii="Courier New" w:hAnsi="Courier New"/>
+          <w:color w:val="595959"/>
+          <w:sz w:val="18"/>
+        </w:rPr>
+        <w:t>git clone https://github.com/ticarpi/jwt_tool.git /tmp/jwt_tool</w:t>
+      </w:r>
+    </w:p>
+    <w:p>
+      <w:pPr>
+        <w:pStyle w:val="Normal"/>
+        <w:spacing w:after="20"/>
+        <w:ind w:left="432"/>
+      </w:pPr>
+      <w:r>
+        <w:rPr>
+          <w:rFonts w:ascii="Courier New" w:hAnsi="Courier New"/>
+          <w:color w:val="595959"/>
+          <w:sz w:val="18"/>
+        </w:rPr>
+        <w:t>cd /tmp/jwt_tool &amp;&amp; pip3 install -r requirements.txt</w:t>
+      </w:r>
+    </w:p>
+    <w:p>
+      <w:pPr>
+        <w:spacing w:after="60"/>
+      </w:pPr>
+      <w:r>
+        <w:t>Get a JWT, then decode and attack it:</w:t>
+      </w:r>
+    </w:p>
+    <w:p>
+      <w:pPr>
+        <w:pStyle w:val="Normal"/>
+        <w:spacing w:after="20"/>
+        <w:ind w:left="432"/>
+      </w:pPr>
+      <w:r>
+        <w:rPr>
+          <w:rFonts w:ascii="Courier New" w:hAnsi="Courier New"/>
+          <w:color w:val="595959"/>
+          <w:sz w:val="18"/>
+        </w:rPr>
+        <w:t xml:space="preserve">LOGIN=$(curl -s -X POST http://localhost:8888/identity/api/auth/login \</w:t>
+      </w:r>
+    </w:p>
+    <w:p>
+      <w:pPr>
+        <w:pStyle w:val="Normal"/>
+        <w:spacing w:after="20"/>
+        <w:ind w:left="720"/>
+      </w:pPr>
+      <w:r>
+        <w:rPr>
+          <w:rFonts w:ascii="Courier New" w:hAnsi="Courier New"/>
+          <w:color w:val="595959"/>
+          <w:sz w:val="18"/>
+        </w:rPr>
+        <w:t>-H "Content-Type: application/json" \</w:t>
+      </w:r>
+    </w:p>
+    <w:p>
+      <w:pPr>
+        <w:pStyle w:val="Normal"/>
+        <w:spacing w:after="20"/>
+        <w:ind w:left="720"/>
+      </w:pPr>
+      <w:r>
+        <w:rPr>
+          <w:rFonts w:ascii="Courier New" w:hAnsi="Courier New"/>
+          <w:color w:val="595959"/>
+          <w:sz w:val="18"/>
+        </w:rPr>
+        <w:t>-d '{"email":"user@lab.local","password":"Password1!"}')</w:t>
+      </w:r>
+    </w:p>
+    <w:p>
+      <w:pPr>
+        <w:pStyle w:val="Normal"/>
+        <w:spacing w:after="20"/>
+        <w:ind w:left="432"/>
+      </w:pPr>
+      <w:r>
+        <w:rPr>
+          <w:rFonts w:ascii="Courier New" w:hAnsi="Courier New"/>
+          <w:color w:val="595959"/>
+          <w:sz w:val="18"/>
+        </w:rPr>
+        <w:t>export TOKEN=$(echo $LOGIN | python3 -c "import sys,json; print(json.load(sys.stdin)['token'])")</w:t>
+      </w:r>
+    </w:p>
+    <w:p>
+      <w:pPr>
+        <w:pStyle w:val="Normal"/>
+        <w:spacing w:after="20"/>
+        <w:ind w:left="432"/>
+      </w:pPr>
+      <w:r>
+        <w:rPr>
+          <w:rFonts w:ascii="Courier New" w:hAnsi="Courier New"/>
+          <w:color w:val="595959"/>
+          <w:sz w:val="18"/>
+        </w:rPr>
+        <w:t>python3 /tmp/jwt_tool/jwt_tool.py "$TOKEN"          # decode</w:t>
+      </w:r>
+    </w:p>
+    <w:p>
+      <w:pPr>
+        <w:pStyle w:val="Normal"/>
+        <w:spacing w:after="40"/>
+        <w:ind w:left="432"/>
+      </w:pPr>
+      <w:r>
+        <w:rPr>
+          <w:rFonts w:ascii="Courier New" w:hAnsi="Courier New"/>
+          <w:color w:val="595959"/>
+          <w:sz w:val="18"/>
+        </w:rPr>
+        <w:t>python3 /tmp/jwt_tool/jwt_tool.py "$TOKEN" -X a     # alg:none attack</w:t>
+      </w:r>
+    </w:p>
+    <w:p>
+      <w:pPr>
+        <w:spacing w:after="60"/>
+      </w:pPr>
+      <w:r>
+        <w:t xml:space="preserve">Test the forged token against the dashboard endpoint (copy one of the </w:t>
+      </w:r>
+      <w:r>
+        <w:rPr>
+          <w:rFonts w:ascii="Courier New" w:hAnsi="Courier New"/>
+          <w:sz w:val="18"/>
+        </w:rPr>
+        <w:t>eyJhbGciOiJub25lIn0...</w:t>
+      </w:r>
+      <w:r>
+        <w:t xml:space="preserve"> tokens from the jwt_tool output):</w:t>
+      </w:r>
+    </w:p>
+    <w:p>
+      <w:pPr>
+        <w:pStyle w:val="Normal"/>
+        <w:spacing w:after="40"/>
+        <w:ind w:left="432"/>
+      </w:pPr>
+      <w:r>
+        <w:rPr>
+          <w:rFonts w:ascii="Courier New" w:hAnsi="Courier New"/>
+          <w:color w:val="595959"/>
+          <w:sz w:val="18"/>
+        </w:rPr>
+        <w:t>curl -s http://localhost:8888/identity/api/v2/user/dashboard -H "Authorization: Bearer &lt;forged_token&gt;"</w:t>
+      </w:r>
+    </w:p>
+    <w:p>
+      <w:pPr>
+        <w:spacing w:after="60"/>
+      </w:pPr>
+      <w:r>
+        <w:rPr>
+          <w:b/>
+          <w:color w:val="C00000"/>
+        </w:rPr>
+        <w:t>Expected result: HTTP 200 with full user profile JSON.</w:t>
+      </w:r>
+      <w:r>
+        <w:t xml:space="preserve">  crAPI does not validate the JWT algorithm — the unsigned forged token is accepted. Confirmed 2026-03-17.</w:t>
+      </w:r>
+    </w:p>
+    <w:p>
+      <w:pPr>
+        <w:pStyle w:val="Heading3"/>
+        <w:spacing w:before="160" w:after="60"/>
+      </w:pPr>
+      <w:r>
+        <w:t>3.5.8  kiterunner — API Endpoint Discovery</w:t>
+      </w:r>
+    </w:p>
+    <w:p>
+      <w:pPr>
+        <w:spacing w:after="60"/>
+      </w:pPr>
+      <w:r>
+        <w:t>Install kiterunner (no Homebrew formula — build from source):</w:t>
+      </w:r>
+    </w:p>
+    <w:p>
+      <w:pPr>
+        <w:pStyle w:val="Normal"/>
+        <w:spacing w:after="20"/>
+        <w:ind w:left="432"/>
+      </w:pPr>
+      <w:r>
+        <w:rPr>
+          <w:rFonts w:ascii="Courier New" w:hAnsi="Courier New"/>
+          <w:color w:val="595959"/>
+          <w:sz w:val="18"/>
+        </w:rPr>
+        <w:t>brew install go</w:t>
+      </w:r>
+    </w:p>
+    <w:p>
+      <w:pPr>
+        <w:pStyle w:val="Normal"/>
+        <w:spacing w:after="20"/>
+        <w:ind w:left="432"/>
+      </w:pPr>
+      <w:r>
+        <w:rPr>
+          <w:rFonts w:ascii="Courier New" w:hAnsi="Courier New"/>
+          <w:color w:val="595959"/>
+          <w:sz w:val="18"/>
+        </w:rPr>
+        <w:t>git clone https://github.com/assetnote/kiterunner.git /tmp/kiterunner</w:t>
+      </w:r>
+    </w:p>
+    <w:p>
+      <w:pPr>
+        <w:pStyle w:val="Normal"/>
+        <w:spacing w:after="40"/>
+        <w:ind w:left="432"/>
+      </w:pPr>
+      <w:r>
+        <w:rPr>
+          <w:rFonts w:ascii="Courier New" w:hAnsi="Courier New"/>
+          <w:color w:val="595959"/>
+          <w:sz w:val="18"/>
+        </w:rPr>
+        <w:t>cd /tmp/kiterunner &amp;&amp; go build -o ~/bin/kr ./cmd/kiterunner/ &amp;&amp; export PATH=$PATH:~/bin</w:t>
+      </w:r>
+    </w:p>
+    <w:p>
+      <w:pPr>
+        <w:spacing w:after="60"/>
+      </w:pPr>
+      <w:r>
+        <w:t>Download wordlist and scan crAPI:</w:t>
+      </w:r>
+    </w:p>
+    <w:p>
+      <w:pPr>
+        <w:pStyle w:val="Normal"/>
+        <w:spacing w:after="20"/>
+        <w:ind w:left="432"/>
+      </w:pPr>
+      <w:r>
+        <w:rPr>
+          <w:rFonts w:ascii="Courier New" w:hAnsi="Courier New"/>
+          <w:color w:val="595959"/>
+          <w:sz w:val="18"/>
+        </w:rPr>
+        <w:t>curl -L https://raw.githubusercontent.com/danielmiessler/SecLists/master/Discovery/Web-Content/api/api-seen-in-wild.txt -o ~/kr-wordlist.txt</w:t>
+      </w:r>
+    </w:p>
+    <w:p>
+      <w:pPr>
+        <w:pStyle w:val="Normal"/>
+        <w:spacing w:after="20"/>
+        <w:ind w:left="432"/>
+      </w:pPr>
+      <w:r>
+        <w:rPr>
+          <w:rFonts w:ascii="Courier New" w:hAnsi="Courier New"/>
+          <w:color w:val="595959"/>
+          <w:sz w:val="18"/>
+        </w:rPr>
+        <w:t>kr brute http://localhost:8888/identity -w ~/kr-wordlist.txt --fail-status-codes 400,401,403,404,429,500 -o text</w:t>
+      </w:r>
+    </w:p>
+    <w:p>
+      <w:pPr>
+        <w:pStyle w:val="Normal"/>
+        <w:spacing w:after="40"/>
+        <w:ind w:left="432"/>
+      </w:pPr>
+      <w:r>
+        <w:rPr>
+          <w:rFonts w:ascii="Courier New" w:hAnsi="Courier New"/>
+          <w:color w:val="595959"/>
+          <w:sz w:val="18"/>
+        </w:rPr>
+        <w:t>kr brute http://localhost:8888/community -w ~/kr-wordlist.txt --fail-status-codes 400,401,403,404,429,500 -o text</w:t>
+      </w:r>
+    </w:p>
+    <w:p>
+      <w:pPr>
+        <w:spacing w:after="60"/>
+      </w:pPr>
+      <w:r>
+        <w:rPr>
+          <w:b/>
+        </w:rPr>
+        <w:t xml:space="preserve">Result: 0 endpoints discovered across all scans (91,380 probes each).  </w:t>
+      </w:r>
+      <w:r>
+        <w:t>This is expected — crAPI’s deep path structure (/identity/api/v2/...) is not present in generic API wordlists. 0 hits does not mean no vulnerabilities; it means wordlist-based discovery failed. The alg:none and BOLA vulnerabilities from Phase 1 are unaffected.</w:t>
+      </w:r>
+    </w:p>
+    <w:p>
+      <w:pPr>
+        <w:pStyle w:val="Heading3"/>
+        <w:spacing w:before="160" w:after="60"/>
+      </w:pPr>
+      <w:r>
+        <w:t>3.5.9  ZAP OpenAPI Scan (Attempted) and vAPI</w:t>
+      </w:r>
+    </w:p>
+    <w:p>
+      <w:pPr>
+        <w:spacing w:after="60"/>
+      </w:pPr>
+      <w:r>
+        <w:t xml:space="preserve">ZAP API scan via OpenAPI spec was attempted. crAPI does not expose its spec via any standard HTTP endpoint — /identity/api/openapi-docs, /v3/api-docs, /identity/v3/api-docs, and /identity/swagger-ui/index.html all returned 404 or 401. ZAP spec-driven scan was not completed. ZAP GUI spider scan from Phase 1 remains the automated scan result for this module.  </w:t>
+      </w:r>
+    </w:p>
+    <w:p>
+      <w:pPr>
+        <w:spacing w:after="80"/>
+      </w:pPr>
+      <w:r>
+        <w:t>vAPI was cloned and started (port 8000, Redoc UI confirmed). Database seeding failed due to an upstream PHP 7.4 / MySQL 8 incompatibility in the flags migration file. vAPI was excluded from testing scope for this module revision.</w:t>
+      </w:r>
+    </w:p>
+    <w:p>
+      <w:r>
+        <w:br w:type="page"/>
+      </w:r>
+    </w:p>
+    <w:p>
+      <w:pPr>
         <w:pStyle w:val="Heading1"/>
         <w:spacing w:before="320" w:after="80"/>
       </w:pPr>
@@ -11991,131 +12363,23 @@
           <w:sz w:val="18"/>
         </w:rPr>
         <w:t xml:space="preserve">docker compose --profile appsensor build</w:t>
-      </w:r>
-      <w:r>
-        <w:rPr>
-          <w:rFonts w:ascii="Courier New" w:hAnsi="Courier New"/>
-          <w:sz w:val="18"/>
-        </w:rPr>
         <w:br/>
-      </w:r>
-      <w:r>
-        <w:rPr>
-          <w:rFonts w:ascii="Courier New" w:hAnsi="Courier New"/>
-          <w:sz w:val="18"/>
-        </w:rPr>
         <w:t xml:space="preserve">docker compose --profile appsensor up -d</w:t>
-      </w:r>
-      <w:r>
-        <w:rPr>
-          <w:rFonts w:ascii="Courier New" w:hAnsi="Courier New"/>
-          <w:sz w:val="18"/>
-        </w:rPr>
         <w:br/>
-      </w:r>
-      <w:r>
-        <w:rPr>
-          <w:rFonts w:ascii="Courier New" w:hAnsi="Courier New"/>
-          <w:sz w:val="18"/>
-        </w:rPr>
         <w:t xml:space="preserve">sleep 20</w:t>
-      </w:r>
-      <w:r>
-        <w:rPr>
-          <w:rFonts w:ascii="Courier New" w:hAnsi="Courier New"/>
-          <w:sz w:val="18"/>
-        </w:rPr>
         <w:br/>
-      </w:r>
-      <w:r>
-        <w:rPr>
-          <w:rFonts w:ascii="Courier New" w:hAnsi="Courier New"/>
-          <w:sz w:val="18"/>
-        </w:rPr>
         <w:t xml:space="preserve"/>
-      </w:r>
-      <w:r>
-        <w:rPr>
-          <w:rFonts w:ascii="Courier New" w:hAnsi="Courier New"/>
-          <w:sz w:val="18"/>
-        </w:rPr>
         <w:br/>
-      </w:r>
-      <w:r>
-        <w:rPr>
-          <w:rFonts w:ascii="Courier New" w:hAnsi="Courier New"/>
-          <w:sz w:val="18"/>
-        </w:rPr>
         <w:t xml:space="preserve">for i in {1..6}; do</w:t>
-      </w:r>
-      <w:r>
-        <w:rPr>
-          <w:rFonts w:ascii="Courier New" w:hAnsi="Courier New"/>
-          <w:sz w:val="18"/>
-        </w:rPr>
         <w:br/>
-      </w:r>
-      <w:r>
-        <w:rPr>
-          <w:rFonts w:ascii="Courier New" w:hAnsi="Courier New"/>
-          <w:sz w:val="18"/>
-        </w:rPr>
         <w:t xml:space="preserve">  echo -n "Hit $i: "</w:t>
-      </w:r>
-      <w:r>
-        <w:rPr>
-          <w:rFonts w:ascii="Courier New" w:hAnsi="Courier New"/>
-          <w:sz w:val="18"/>
-        </w:rPr>
         <w:br/>
-      </w:r>
-      <w:r>
-        <w:rPr>
-          <w:rFonts w:ascii="Courier New" w:hAnsi="Courier New"/>
-          <w:sz w:val="18"/>
-        </w:rPr>
         <w:t xml:space="preserve">  curl -s -o /dev/null -w "%{http_code}" \</w:t>
-      </w:r>
-      <w:r>
-        <w:rPr>
-          <w:rFonts w:ascii="Courier New" w:hAnsi="Courier New"/>
-          <w:sz w:val="18"/>
-        </w:rPr>
         <w:br/>
-      </w:r>
-      <w:r>
-        <w:rPr>
-          <w:rFonts w:ascii="Courier New" w:hAnsi="Courier New"/>
-          <w:sz w:val="18"/>
-        </w:rPr>
         <w:t xml:space="preserve">    "http://localhost:3004/rest/products/search?q=%27+OR+1%3D1--"</w:t>
-      </w:r>
-      <w:r>
-        <w:rPr>
-          <w:rFonts w:ascii="Courier New" w:hAnsi="Courier New"/>
-          <w:sz w:val="18"/>
-        </w:rPr>
         <w:br/>
-      </w:r>
-      <w:r>
-        <w:rPr>
-          <w:rFonts w:ascii="Courier New" w:hAnsi="Courier New"/>
-          <w:sz w:val="18"/>
-        </w:rPr>
         <w:t xml:space="preserve">  echo</w:t>
-      </w:r>
-      <w:r>
-        <w:rPr>
-          <w:rFonts w:ascii="Courier New" w:hAnsi="Courier New"/>
-          <w:sz w:val="18"/>
-        </w:rPr>
         <w:br/>
-      </w:r>
-      <w:r>
-        <w:rPr>
-          <w:rFonts w:ascii="Courier New" w:hAnsi="Courier New"/>
-          <w:sz w:val="18"/>
-        </w:rPr>
         <w:t xml:space="preserve">done</w:t>
       </w:r>
     </w:p>
@@ -12146,75 +12410,15 @@
           <w:sz w:val="18"/>
         </w:rPr>
         <w:t xml:space="preserve">Hit 1: 500  (LOG — AppSensor passes through; SQLite throws on malicious query)</w:t>
-      </w:r>
-      <w:r>
-        <w:rPr>
-          <w:rFonts w:ascii="Courier New" w:hAnsi="Courier New"/>
-          <w:sz w:val="18"/>
-        </w:rPr>
         <w:br/>
-      </w:r>
-      <w:r>
-        <w:rPr>
-          <w:rFonts w:ascii="Courier New" w:hAnsi="Courier New"/>
-          <w:sz w:val="18"/>
-        </w:rPr>
         <w:t xml:space="preserve">Hit 2: 429  (WARN — IE2 fires multiple times per HTTP request on Juice Shop)</w:t>
-      </w:r>
-      <w:r>
-        <w:rPr>
-          <w:rFonts w:ascii="Courier New" w:hAnsi="Courier New"/>
-          <w:sz w:val="18"/>
-        </w:rPr>
         <w:br/>
-      </w:r>
-      <w:r>
-        <w:rPr>
-          <w:rFonts w:ascii="Courier New" w:hAnsi="Courier New"/>
-          <w:sz w:val="18"/>
-        </w:rPr>
         <w:t xml:space="preserve">Hit 3: 429</w:t>
-      </w:r>
-      <w:r>
-        <w:rPr>
-          <w:rFonts w:ascii="Courier New" w:hAnsi="Courier New"/>
-          <w:sz w:val="18"/>
-        </w:rPr>
         <w:br/>
-      </w:r>
-      <w:r>
-        <w:rPr>
-          <w:rFonts w:ascii="Courier New" w:hAnsi="Courier New"/>
-          <w:sz w:val="18"/>
-        </w:rPr>
         <w:t xml:space="preserve">Hit 4: 429</w:t>
-      </w:r>
-      <w:r>
-        <w:rPr>
-          <w:rFonts w:ascii="Courier New" w:hAnsi="Courier New"/>
-          <w:sz w:val="18"/>
-        </w:rPr>
         <w:br/>
-      </w:r>
-      <w:r>
-        <w:rPr>
-          <w:rFonts w:ascii="Courier New" w:hAnsi="Courier New"/>
-          <w:sz w:val="18"/>
-        </w:rPr>
         <w:t xml:space="preserve">Hit 5: 403  (BLOCK)</w:t>
-      </w:r>
-      <w:r>
-        <w:rPr>
-          <w:rFonts w:ascii="Courier New" w:hAnsi="Courier New"/>
-          <w:sz w:val="18"/>
-        </w:rPr>
         <w:br/>
-      </w:r>
-      <w:r>
-        <w:rPr>
-          <w:rFonts w:ascii="Courier New" w:hAnsi="Courier New"/>
-          <w:sz w:val="18"/>
-        </w:rPr>
         <w:t xml:space="preserve">Hit 6: 403</w:t>
       </w:r>
     </w:p>
@@ -12304,33 +12508,9 @@
           <w:sz w:val="18"/>
         </w:rPr>
         <w:t xml:space="preserve">docker compose --profile datadog-asm build</w:t>
-      </w:r>
-      <w:r>
-        <w:rPr>
-          <w:rFonts w:ascii="Courier New" w:hAnsi="Courier New"/>
-          <w:sz w:val="18"/>
-        </w:rPr>
         <w:br/>
-      </w:r>
-      <w:r>
-        <w:rPr>
-          <w:rFonts w:ascii="Courier New" w:hAnsi="Courier New"/>
-          <w:sz w:val="18"/>
-        </w:rPr>
         <w:t xml:space="preserve">docker compose --profile datadog-asm up -d</w:t>
-      </w:r>
-      <w:r>
-        <w:rPr>
-          <w:rFonts w:ascii="Courier New" w:hAnsi="Courier New"/>
-          <w:sz w:val="18"/>
-        </w:rPr>
         <w:br/>
-      </w:r>
-      <w:r>
-        <w:rPr>
-          <w:rFonts w:ascii="Courier New" w:hAnsi="Courier New"/>
-          <w:sz w:val="18"/>
-        </w:rPr>
         <w:t xml:space="preserve">sleep 25</w:t>
       </w:r>
     </w:p>
@@ -12360,145 +12540,25 @@
           <w:sz w:val="18"/>
         </w:rPr>
         <w:t xml:space="preserve">curl -s -o /dev/null -w "SQLi:  %{http_code}\n" \</w:t>
-      </w:r>
-      <w:r>
-        <w:rPr>
-          <w:rFonts w:ascii="Courier New" w:hAnsi="Courier New"/>
-          <w:sz w:val="18"/>
-        </w:rPr>
         <w:br/>
-      </w:r>
-      <w:r>
-        <w:rPr>
-          <w:rFonts w:ascii="Courier New" w:hAnsi="Courier New"/>
-          <w:sz w:val="18"/>
-        </w:rPr>
         <w:t xml:space="preserve">  "http://localhost:3005/rest/products/search?q=%27+OR+1%3D1--"</w:t>
-      </w:r>
-      <w:r>
-        <w:rPr>
-          <w:rFonts w:ascii="Courier New" w:hAnsi="Courier New"/>
-          <w:sz w:val="18"/>
-        </w:rPr>
         <w:br/>
-      </w:r>
-      <w:r>
-        <w:rPr>
-          <w:rFonts w:ascii="Courier New" w:hAnsi="Courier New"/>
-          <w:sz w:val="18"/>
-        </w:rPr>
         <w:t xml:space="preserve"/>
-      </w:r>
-      <w:r>
-        <w:rPr>
-          <w:rFonts w:ascii="Courier New" w:hAnsi="Courier New"/>
-          <w:sz w:val="18"/>
-        </w:rPr>
         <w:br/>
-      </w:r>
-      <w:r>
-        <w:rPr>
-          <w:rFonts w:ascii="Courier New" w:hAnsi="Courier New"/>
-          <w:sz w:val="18"/>
-        </w:rPr>
         <w:t xml:space="preserve">curl -s -o /dev/null -w "XSS:   %{http_code}\n" \</w:t>
-      </w:r>
-      <w:r>
-        <w:rPr>
-          <w:rFonts w:ascii="Courier New" w:hAnsi="Courier New"/>
-          <w:sz w:val="18"/>
-        </w:rPr>
         <w:br/>
-      </w:r>
-      <w:r>
-        <w:rPr>
-          <w:rFonts w:ascii="Courier New" w:hAnsi="Courier New"/>
-          <w:sz w:val="18"/>
-        </w:rPr>
         <w:t xml:space="preserve">  "http://localhost:3005/rest/products/search?q=%3Cscript%3Ealert(1)%3C%2Fscript%3E"</w:t>
-      </w:r>
-      <w:r>
-        <w:rPr>
-          <w:rFonts w:ascii="Courier New" w:hAnsi="Courier New"/>
-          <w:sz w:val="18"/>
-        </w:rPr>
         <w:br/>
-      </w:r>
-      <w:r>
-        <w:rPr>
-          <w:rFonts w:ascii="Courier New" w:hAnsi="Courier New"/>
-          <w:sz w:val="18"/>
-        </w:rPr>
         <w:t xml:space="preserve"/>
-      </w:r>
-      <w:r>
-        <w:rPr>
-          <w:rFonts w:ascii="Courier New" w:hAnsi="Courier New"/>
-          <w:sz w:val="18"/>
-        </w:rPr>
         <w:br/>
-      </w:r>
-      <w:r>
-        <w:rPr>
-          <w:rFonts w:ascii="Courier New" w:hAnsi="Courier New"/>
-          <w:sz w:val="18"/>
-        </w:rPr>
         <w:t xml:space="preserve">curl -s -o /dev/null -w "LFI:   %{http_code}\n" \</w:t>
-      </w:r>
-      <w:r>
-        <w:rPr>
-          <w:rFonts w:ascii="Courier New" w:hAnsi="Courier New"/>
-          <w:sz w:val="18"/>
-        </w:rPr>
         <w:br/>
-      </w:r>
-      <w:r>
-        <w:rPr>
-          <w:rFonts w:ascii="Courier New" w:hAnsi="Courier New"/>
-          <w:sz w:val="18"/>
-        </w:rPr>
         <w:t xml:space="preserve">  "http://localhost:3005/rest/products/search?q=..%2F..%2Fetc%2Fpasswd"</w:t>
-      </w:r>
-      <w:r>
-        <w:rPr>
-          <w:rFonts w:ascii="Courier New" w:hAnsi="Courier New"/>
-          <w:sz w:val="18"/>
-        </w:rPr>
         <w:br/>
-      </w:r>
-      <w:r>
-        <w:rPr>
-          <w:rFonts w:ascii="Courier New" w:hAnsi="Courier New"/>
-          <w:sz w:val="18"/>
-        </w:rPr>
         <w:t xml:space="preserve"/>
-      </w:r>
-      <w:r>
-        <w:rPr>
-          <w:rFonts w:ascii="Courier New" w:hAnsi="Courier New"/>
-          <w:sz w:val="18"/>
-        </w:rPr>
         <w:br/>
-      </w:r>
-      <w:r>
-        <w:rPr>
-          <w:rFonts w:ascii="Courier New" w:hAnsi="Courier New"/>
-          <w:sz w:val="18"/>
-        </w:rPr>
         <w:t xml:space="preserve">curl -s -o /dev/null -w "clean: %{http_code}\n" \</w:t>
-      </w:r>
-      <w:r>
-        <w:rPr>
-          <w:rFonts w:ascii="Courier New" w:hAnsi="Courier New"/>
-          <w:sz w:val="18"/>
-        </w:rPr>
         <w:br/>
-      </w:r>
-      <w:r>
-        <w:rPr>
-          <w:rFonts w:ascii="Courier New" w:hAnsi="Courier New"/>
-          <w:sz w:val="18"/>
-        </w:rPr>
         <w:t xml:space="preserve">  "http://localhost:3005/rest/products/search?q=apple"</w:t>
       </w:r>
     </w:p>
@@ -13142,33 +13202,9 @@
           <w:sz w:val="18"/>
         </w:rPr>
         <w:t xml:space="preserve">echo "DD_API_KEY=your_key_here" &gt;&gt; .env</w:t>
-      </w:r>
-      <w:r>
-        <w:rPr>
-          <w:rFonts w:ascii="Courier New" w:hAnsi="Courier New"/>
-          <w:sz w:val="18"/>
-        </w:rPr>
         <w:br/>
-      </w:r>
-      <w:r>
-        <w:rPr>
-          <w:rFonts w:ascii="Courier New" w:hAnsi="Courier New"/>
-          <w:sz w:val="18"/>
-        </w:rPr>
         <w:t xml:space="preserve">docker compose --profile datadog-asm up -d</w:t>
-      </w:r>
-      <w:r>
-        <w:rPr>
-          <w:rFonts w:ascii="Courier New" w:hAnsi="Courier New"/>
-          <w:sz w:val="18"/>
-        </w:rPr>
         <w:br/>
-      </w:r>
-      <w:r>
-        <w:rPr>
-          <w:rFonts w:ascii="Courier New" w:hAnsi="Courier New"/>
-          <w:sz w:val="18"/>
-        </w:rPr>
         <w:t xml:space="preserve"># View attacks: https://app.datadoghq.com/security/appsec</w:t>
       </w:r>
     </w:p>

</xml_diff>